<commit_message>
feat: segunda versión - panel profesor, CRUD cursos y preguntas
</commit_message>
<xml_diff>
--- a/docs/GeoLearn_Nestor.docx
+++ b/docs/GeoLearn_Nestor.docx
@@ -5,7 +5,6 @@
     <w:p>
       <w:pPr>
         <w:spacing w:before="40" w:after="40"/>
-        <w:ind w:left="708" w:hanging="708"/>
       </w:pPr>
     </w:p>
     <w:p>
@@ -97,17 +96,7 @@
           <w:sz w:val="28"/>
           <w:szCs w:val="28"/>
         </w:rPr>
-        <w:t xml:space="preserve">Plataforma educativa de Historia y </w:t>
-      </w:r>
-      <w:r>
-        <w:rPr>
-          <w:i/>
-          <w:iCs/>
-          <w:color w:val="222222"/>
-          <w:sz w:val="28"/>
-          <w:szCs w:val="28"/>
-        </w:rPr>
-        <w:t>Geografía</w:t>
+        <w:t>Plataforma educativa de Historia y Geografía</w:t>
       </w:r>
     </w:p>
     <w:p>
@@ -156,27 +145,7 @@
           <w:sz w:val="26"/>
           <w:szCs w:val="26"/>
         </w:rPr>
-        <w:t xml:space="preserve">1.ª Entrega  —  </w:t>
-      </w:r>
-      <w:r>
-        <w:rPr>
-          <w:b/>
-          <w:bCs/>
-          <w:color w:val="222222"/>
-          <w:sz w:val="26"/>
-          <w:szCs w:val="26"/>
-        </w:rPr>
-        <w:t>Planificación</w:t>
-      </w:r>
-      <w:r>
-        <w:rPr>
-          <w:b/>
-          <w:bCs/>
-          <w:color w:val="222222"/>
-          <w:sz w:val="26"/>
-          <w:szCs w:val="26"/>
-        </w:rPr>
-        <w:t xml:space="preserve"> del Proyecto</w:t>
+        <w:t>1.ª Entrega  —  Planificación del Proyecto</w:t>
       </w:r>
     </w:p>
     <w:p>
@@ -245,31 +214,7 @@
         <w:rPr>
           <w:color w:val="222222"/>
         </w:rPr>
-        <w:t xml:space="preserve">Desarrollar una </w:t>
-      </w:r>
-      <w:r>
-        <w:rPr>
-          <w:color w:val="222222"/>
-        </w:rPr>
-        <w:t>aplicación</w:t>
-      </w:r>
-      <w:r>
-        <w:rPr>
-          <w:color w:val="222222"/>
-        </w:rPr>
-        <w:t xml:space="preserve"> web educativa sobre historia y </w:t>
-      </w:r>
-      <w:r>
-        <w:rPr>
-          <w:color w:val="222222"/>
-        </w:rPr>
-        <w:t>geografía</w:t>
-      </w:r>
-      <w:r>
-        <w:rPr>
-          <w:color w:val="222222"/>
-        </w:rPr>
-        <w:t>, en la que los alumnos puedan aprender mediante cuestionarios tipo trivial, los profesores gestionen los contenidos y los administradores supervisen el sistema.</w:t>
+        <w:t>Desarrollar una aplicación web educativa sobre historia y geografía, en la que los alumnos puedan aprender mediante cuestionarios tipo trivial, los profesores gestionen los contenidos y los administradores supervisen el sistema.</w:t>
       </w:r>
     </w:p>
     <w:p>
@@ -295,10 +240,7 @@
         <w:pStyle w:val="Ttulo2"/>
       </w:pPr>
       <w:r>
-        <w:t xml:space="preserve">1.2. Objetivos </w:t>
-      </w:r>
-      <w:r>
-        <w:t>Específicos</w:t>
+        <w:t>1.2. Objetivos Específicos</w:t>
       </w:r>
     </w:p>
     <w:p>
@@ -336,19 +278,7 @@
         <w:rPr>
           <w:color w:val="222222"/>
         </w:rPr>
-        <w:t xml:space="preserve">Sistema de </w:t>
-      </w:r>
-      <w:r>
-        <w:rPr>
-          <w:color w:val="222222"/>
-        </w:rPr>
-        <w:t>autenticación</w:t>
-      </w:r>
-      <w:r>
-        <w:rPr>
-          <w:color w:val="222222"/>
-        </w:rPr>
-        <w:t xml:space="preserve"> con tres roles diferenciados: administrador, profesor y alumno.</w:t>
+        <w:t>Sistema de autenticación con tres roles diferenciados: administrador, profesor y alumno.</w:t>
       </w:r>
     </w:p>
     <w:p>
@@ -380,31 +310,7 @@
         <w:rPr>
           <w:color w:val="222222"/>
         </w:rPr>
-        <w:t xml:space="preserve">Registro del progreso de cada alumno con </w:t>
-      </w:r>
-      <w:r>
-        <w:rPr>
-          <w:color w:val="222222"/>
-        </w:rPr>
-        <w:t>visualización</w:t>
-      </w:r>
-      <w:r>
-        <w:rPr>
-          <w:color w:val="222222"/>
-        </w:rPr>
-        <w:t xml:space="preserve"> de </w:t>
-      </w:r>
-      <w:r>
-        <w:rPr>
-          <w:color w:val="222222"/>
-        </w:rPr>
-        <w:t>estadísticas</w:t>
-      </w:r>
-      <w:r>
-        <w:rPr>
-          <w:color w:val="222222"/>
-        </w:rPr>
-        <w:t>.</w:t>
+        <w:t>Registro del progreso de cada alumno con visualización de estadísticas.</w:t>
       </w:r>
     </w:p>
     <w:p>
@@ -420,31 +326,7 @@
         <w:rPr>
           <w:color w:val="222222"/>
         </w:rPr>
-        <w:t xml:space="preserve">Sistema de cuestionarios con </w:t>
-      </w:r>
-      <w:r>
-        <w:rPr>
-          <w:color w:val="222222"/>
-        </w:rPr>
-        <w:t>corrección</w:t>
-      </w:r>
-      <w:r>
-        <w:rPr>
-          <w:color w:val="222222"/>
-        </w:rPr>
-        <w:t xml:space="preserve"> </w:t>
-      </w:r>
-      <w:r>
-        <w:rPr>
-          <w:color w:val="222222"/>
-        </w:rPr>
-        <w:t>automática</w:t>
-      </w:r>
-      <w:r>
-        <w:rPr>
-          <w:color w:val="222222"/>
-        </w:rPr>
-        <w:t xml:space="preserve"> y guardado de resultados.</w:t>
+        <w:t>Sistema de cuestionarios con corrección automática y guardado de resultados.</w:t>
       </w:r>
     </w:p>
     <w:p>
@@ -476,31 +358,7 @@
         <w:rPr>
           <w:color w:val="222222"/>
         </w:rPr>
-        <w:t xml:space="preserve">Panel de </w:t>
-      </w:r>
-      <w:r>
-        <w:rPr>
-          <w:color w:val="222222"/>
-        </w:rPr>
-        <w:t>administración</w:t>
-      </w:r>
-      <w:r>
-        <w:rPr>
-          <w:color w:val="222222"/>
-        </w:rPr>
-        <w:t xml:space="preserve"> para </w:t>
-      </w:r>
-      <w:r>
-        <w:rPr>
-          <w:color w:val="222222"/>
-        </w:rPr>
-        <w:t>supervisión</w:t>
-      </w:r>
-      <w:r>
-        <w:rPr>
-          <w:color w:val="222222"/>
-        </w:rPr>
-        <w:t xml:space="preserve"> global de la plataforma.</w:t>
+        <w:t>Panel de administración para supervisión global de la plataforma.</w:t>
       </w:r>
     </w:p>
     <w:p>
@@ -522,19 +380,7 @@
           <w:sz w:val="22"/>
           <w:szCs w:val="22"/>
         </w:rPr>
-        <w:t xml:space="preserve">b) Objetivos </w:t>
-      </w:r>
-      <w:r>
-        <w:rPr>
-          <w:b/>
-          <w:bCs/>
-          <w:i/>
-          <w:iCs/>
-          <w:color w:val="222222"/>
-          <w:sz w:val="22"/>
-          <w:szCs w:val="22"/>
-        </w:rPr>
-        <w:t>técnicos</w:t>
+        <w:t>b) Objetivos técnicos</w:t>
       </w:r>
     </w:p>
     <w:p>
@@ -598,19 +444,7 @@
         <w:rPr>
           <w:color w:val="222222"/>
         </w:rPr>
-        <w:t xml:space="preserve">Control de versiones con Git y </w:t>
-      </w:r>
-      <w:r>
-        <w:rPr>
-          <w:color w:val="222222"/>
-        </w:rPr>
-        <w:t>publicación</w:t>
-      </w:r>
-      <w:r>
-        <w:rPr>
-          <w:color w:val="222222"/>
-        </w:rPr>
-        <w:t xml:space="preserve"> en GitHub usando ramas (main, develop, feature).</w:t>
+        <w:t>Control de versiones con Git y publicación en GitHub usando ramas (main, develop, feature).</w:t>
       </w:r>
     </w:p>
     <w:p>
@@ -626,19 +460,7 @@
         <w:rPr>
           <w:color w:val="222222"/>
         </w:rPr>
-        <w:t xml:space="preserve">API REST </w:t>
-      </w:r>
-      <w:r>
-        <w:rPr>
-          <w:color w:val="222222"/>
-        </w:rPr>
-        <w:t>básica</w:t>
-      </w:r>
-      <w:r>
-        <w:rPr>
-          <w:color w:val="222222"/>
-        </w:rPr>
-        <w:t xml:space="preserve"> para que el frontend consuma datos con fetch() sin recargar la pagina.</w:t>
+        <w:t>API REST básica para que el frontend consuma datos con fetch() sin recargar la pagina.</w:t>
       </w:r>
     </w:p>
     <w:p>
@@ -740,31 +562,7 @@
         <w:rPr>
           <w:color w:val="222222"/>
         </w:rPr>
-        <w:t xml:space="preserve">Practicar la </w:t>
-      </w:r>
-      <w:r>
-        <w:rPr>
-          <w:color w:val="222222"/>
-        </w:rPr>
-        <w:t>documentación</w:t>
-      </w:r>
-      <w:r>
-        <w:rPr>
-          <w:color w:val="222222"/>
-        </w:rPr>
-        <w:t xml:space="preserve"> </w:t>
-      </w:r>
-      <w:r>
-        <w:rPr>
-          <w:color w:val="222222"/>
-        </w:rPr>
-        <w:t>técnica</w:t>
-      </w:r>
-      <w:r>
-        <w:rPr>
-          <w:color w:val="222222"/>
-        </w:rPr>
-        <w:t xml:space="preserve"> de un proyecto.</w:t>
+        <w:t>Practicar la documentación técnica de un proyecto.</w:t>
       </w:r>
     </w:p>
     <w:p>
@@ -810,31 +608,7 @@
         <w:rPr>
           <w:color w:val="222222"/>
         </w:rPr>
-        <w:t xml:space="preserve">El proyecto se desarrolla en cinco fases a lo largo del curso. La </w:t>
-      </w:r>
-      <w:r>
-        <w:rPr>
-          <w:color w:val="222222"/>
-        </w:rPr>
-        <w:t>documentación</w:t>
-      </w:r>
-      <w:r>
-        <w:rPr>
-          <w:color w:val="222222"/>
-        </w:rPr>
-        <w:t xml:space="preserve"> es una actividad transversal que se actualiza en cada fase. La </w:t>
-      </w:r>
-      <w:r>
-        <w:rPr>
-          <w:color w:val="222222"/>
-        </w:rPr>
-        <w:t>duración</w:t>
-      </w:r>
-      <w:r>
-        <w:rPr>
-          <w:color w:val="222222"/>
-        </w:rPr>
-        <w:t xml:space="preserve"> total estimada es de 195 horas.</w:t>
+        <w:t>El proyecto se desarrolla en cinco fases a lo largo del curso. La documentación es una actividad transversal que se actualiza en cada fase. La duración total estimada es de 195 horas.</w:t>
       </w:r>
     </w:p>
     <w:p>
@@ -1209,21 +983,7 @@
                 <w:rFonts w:ascii="Candara" w:hAnsi="Candara"/>
                 <w:color w:val="4472C4" w:themeColor="accent1"/>
               </w:rPr>
-              <w:t xml:space="preserve">Sistema de login, roles, </w:t>
-            </w:r>
-            <w:r>
-              <w:rPr>
-                <w:rFonts w:ascii="Candara" w:hAnsi="Candara"/>
-                <w:color w:val="4472C4" w:themeColor="accent1"/>
-              </w:rPr>
-              <w:t>gestión</w:t>
-            </w:r>
-            <w:r>
-              <w:rPr>
-                <w:rFonts w:ascii="Candara" w:hAnsi="Candara"/>
-                <w:color w:val="4472C4" w:themeColor="accent1"/>
-              </w:rPr>
-              <w:t xml:space="preserve"> de usuarios, cursos y evaluaciones</w:t>
+              <w:t>Sistema de login, roles, gestión de usuarios, cursos y evaluaciones</w:t>
             </w:r>
           </w:p>
         </w:tc>
@@ -1359,21 +1119,7 @@
                 <w:rFonts w:ascii="Candara" w:hAnsi="Candara"/>
                 <w:color w:val="4472C4" w:themeColor="accent1"/>
               </w:rPr>
-              <w:t xml:space="preserve">Progreso del alumno, </w:t>
-            </w:r>
-            <w:r>
-              <w:rPr>
-                <w:rFonts w:ascii="Candara" w:hAnsi="Candara"/>
-                <w:color w:val="4472C4" w:themeColor="accent1"/>
-              </w:rPr>
-              <w:t>estadísticas</w:t>
-            </w:r>
-            <w:r>
-              <w:rPr>
-                <w:rFonts w:ascii="Candara" w:hAnsi="Candara"/>
-                <w:color w:val="4472C4" w:themeColor="accent1"/>
-              </w:rPr>
-              <w:t>, multimedia y API REST</w:t>
+              <w:t>Progreso del alumno, estadísticas, multimedia y API REST</w:t>
             </w:r>
           </w:p>
         </w:tc>
@@ -1509,21 +1255,7 @@
                 <w:rFonts w:ascii="Candara" w:hAnsi="Candara"/>
                 <w:color w:val="4472C4" w:themeColor="accent1"/>
               </w:rPr>
-              <w:t xml:space="preserve">Validaciones, </w:t>
-            </w:r>
-            <w:r>
-              <w:rPr>
-                <w:rFonts w:ascii="Candara" w:hAnsi="Candara"/>
-                <w:color w:val="4472C4" w:themeColor="accent1"/>
-              </w:rPr>
-              <w:t>optimización</w:t>
-            </w:r>
-            <w:r>
-              <w:rPr>
-                <w:rFonts w:ascii="Candara" w:hAnsi="Candara"/>
-                <w:color w:val="4472C4" w:themeColor="accent1"/>
-              </w:rPr>
-              <w:t>, pruebas y diseño responsive</w:t>
+              <w:t>Validaciones, optimización, pruebas y diseño responsive</w:t>
             </w:r>
           </w:p>
         </w:tc>
@@ -1886,19 +1618,7 @@
         <w:rPr>
           <w:color w:val="222222"/>
         </w:rPr>
-        <w:t xml:space="preserve">La siguiente tabla muestra la </w:t>
-      </w:r>
-      <w:r>
-        <w:rPr>
-          <w:color w:val="222222"/>
-        </w:rPr>
-        <w:t>distribución</w:t>
-      </w:r>
-      <w:r>
-        <w:rPr>
-          <w:color w:val="222222"/>
-        </w:rPr>
-        <w:t xml:space="preserve"> temporal de las fases del proyecto:</w:t>
+        <w:t>La siguiente tabla muestra la distribución temporal de las fases del proyecto:</w:t>
       </w:r>
     </w:p>
     <w:p>
@@ -2275,23 +1995,7 @@
                 <w:sz w:val="18"/>
                 <w:szCs w:val="18"/>
               </w:rPr>
-              <w:t xml:space="preserve">F1: </w:t>
-            </w:r>
-            <w:r>
-              <w:rPr>
-                <w:color w:val="4472C4" w:themeColor="accent1"/>
-                <w:sz w:val="18"/>
-                <w:szCs w:val="18"/>
-              </w:rPr>
-              <w:t>Diseño</w:t>
-            </w:r>
-            <w:r>
-              <w:rPr>
-                <w:color w:val="4472C4" w:themeColor="accent1"/>
-                <w:sz w:val="18"/>
-                <w:szCs w:val="18"/>
-              </w:rPr>
-              <w:t xml:space="preserve"> BD y prototipo</w:t>
+              <w:t>F1: Diseño BD y prototipo</w:t>
             </w:r>
           </w:p>
         </w:tc>
@@ -3280,55 +2984,7 @@
         <w:rPr>
           <w:color w:val="222222"/>
         </w:rPr>
-        <w:t xml:space="preserve">A </w:t>
-      </w:r>
-      <w:r>
-        <w:rPr>
-          <w:color w:val="222222"/>
-        </w:rPr>
-        <w:t>continuación</w:t>
-      </w:r>
-      <w:r>
-        <w:rPr>
-          <w:color w:val="222222"/>
-        </w:rPr>
-        <w:t xml:space="preserve"> se describen las pantallas principales de la </w:t>
-      </w:r>
-      <w:r>
-        <w:rPr>
-          <w:color w:val="222222"/>
-        </w:rPr>
-        <w:t>aplicación</w:t>
-      </w:r>
-      <w:r>
-        <w:rPr>
-          <w:color w:val="222222"/>
-        </w:rPr>
-        <w:t xml:space="preserve">. El </w:t>
-      </w:r>
-      <w:r>
-        <w:rPr>
-          <w:color w:val="222222"/>
-        </w:rPr>
-        <w:t>diseño</w:t>
-      </w:r>
-      <w:r>
-        <w:rPr>
-          <w:color w:val="222222"/>
-        </w:rPr>
-        <w:t xml:space="preserve"> es responsive y se ha pensado tanto para escritorio como para dispositivos </w:t>
-      </w:r>
-      <w:r>
-        <w:rPr>
-          <w:color w:val="222222"/>
-        </w:rPr>
-        <w:t>móviles</w:t>
-      </w:r>
-      <w:r>
-        <w:rPr>
-          <w:color w:val="222222"/>
-        </w:rPr>
-        <w:t>.</w:t>
+        <w:t>A continuación se describen las pantallas principales de la aplicación. El diseño es responsive y se ha pensado tanto para escritorio como para dispositivos móviles.</w:t>
       </w:r>
     </w:p>
     <w:p>
@@ -3366,19 +3022,7 @@
         <w:rPr>
           <w:color w:val="222222"/>
         </w:rPr>
-        <w:t xml:space="preserve">Formulario con campos de email y </w:t>
-      </w:r>
-      <w:r>
-        <w:rPr>
-          <w:color w:val="222222"/>
-        </w:rPr>
-        <w:t>contraseña</w:t>
-      </w:r>
-      <w:r>
-        <w:rPr>
-          <w:color w:val="222222"/>
-        </w:rPr>
-        <w:t>.</w:t>
+        <w:t>Formulario con campos de email y contraseña.</w:t>
       </w:r>
     </w:p>
     <w:p>
@@ -3480,19 +3124,7 @@
         <w:rPr>
           <w:color w:val="222222"/>
         </w:rPr>
-        <w:t xml:space="preserve">Acceso </w:t>
-      </w:r>
-      <w:r>
-        <w:rPr>
-          <w:color w:val="222222"/>
-        </w:rPr>
-        <w:t>rápido</w:t>
-      </w:r>
-      <w:r>
-        <w:rPr>
-          <w:color w:val="222222"/>
-        </w:rPr>
-        <w:t xml:space="preserve"> a las evaluaciones disponibles.</w:t>
+        <w:t>Acceso rápido a las evaluaciones disponibles.</w:t>
       </w:r>
     </w:p>
     <w:p>
@@ -3508,19 +3140,7 @@
         <w:rPr>
           <w:color w:val="222222"/>
         </w:rPr>
-        <w:t xml:space="preserve">Resumen de </w:t>
-      </w:r>
-      <w:r>
-        <w:rPr>
-          <w:color w:val="222222"/>
-        </w:rPr>
-        <w:t>estadísticas</w:t>
-      </w:r>
-      <w:r>
-        <w:rPr>
-          <w:color w:val="222222"/>
-        </w:rPr>
-        <w:t>: puntuaciones y partidas jugadas.</w:t>
+        <w:t>Resumen de estadísticas: puntuaciones y partidas jugadas.</w:t>
       </w:r>
     </w:p>
     <w:p>
@@ -3612,19 +3232,7 @@
           <w:sz w:val="22"/>
           <w:szCs w:val="22"/>
         </w:rPr>
-        <w:t xml:space="preserve">Vista de </w:t>
-      </w:r>
-      <w:r>
-        <w:rPr>
-          <w:b/>
-          <w:bCs/>
-          <w:i/>
-          <w:iCs/>
-          <w:color w:val="222222"/>
-          <w:sz w:val="22"/>
-          <w:szCs w:val="22"/>
-        </w:rPr>
-        <w:t>Lección</w:t>
+        <w:t>Vista de Lección</w:t>
       </w:r>
     </w:p>
     <w:p>
@@ -3672,19 +3280,7 @@
         <w:rPr>
           <w:color w:val="222222"/>
         </w:rPr>
-        <w:t xml:space="preserve">Acceso al cuestionario al terminar la </w:t>
-      </w:r>
-      <w:r>
-        <w:rPr>
-          <w:color w:val="222222"/>
-        </w:rPr>
-        <w:t>lección</w:t>
-      </w:r>
-      <w:r>
-        <w:rPr>
-          <w:color w:val="222222"/>
-        </w:rPr>
-        <w:t>.</w:t>
+        <w:t>Acceso al cuestionario al terminar la lección.</w:t>
       </w:r>
     </w:p>
     <w:p>
@@ -3722,31 +3318,7 @@
         <w:rPr>
           <w:color w:val="222222"/>
         </w:rPr>
-        <w:t xml:space="preserve">Preguntas de </w:t>
-      </w:r>
-      <w:r>
-        <w:rPr>
-          <w:color w:val="222222"/>
-        </w:rPr>
-        <w:t>opción</w:t>
-      </w:r>
-      <w:r>
-        <w:rPr>
-          <w:color w:val="222222"/>
-        </w:rPr>
-        <w:t xml:space="preserve"> </w:t>
-      </w:r>
-      <w:r>
-        <w:rPr>
-          <w:color w:val="222222"/>
-        </w:rPr>
-        <w:t>múltiple</w:t>
-      </w:r>
-      <w:r>
-        <w:rPr>
-          <w:color w:val="222222"/>
-        </w:rPr>
-        <w:t xml:space="preserve"> con temporizador.</w:t>
+        <w:t>Preguntas de opción múltiple con temporizador.</w:t>
       </w:r>
     </w:p>
     <w:p>
@@ -3778,19 +3350,7 @@
         <w:rPr>
           <w:color w:val="222222"/>
         </w:rPr>
-        <w:t xml:space="preserve">Resultado inmediato al finalizar y guardado </w:t>
-      </w:r>
-      <w:r>
-        <w:rPr>
-          <w:color w:val="222222"/>
-        </w:rPr>
-        <w:t>automático</w:t>
-      </w:r>
-      <w:r>
-        <w:rPr>
-          <w:color w:val="222222"/>
-        </w:rPr>
-        <w:t xml:space="preserve"> en la BD.</w:t>
+        <w:t>Resultado inmediato al finalizar y guardado automático en la BD.</w:t>
       </w:r>
     </w:p>
     <w:p>
@@ -3820,31 +3380,7 @@
         <w:rPr>
           <w:color w:val="222222"/>
         </w:rPr>
-        <w:t xml:space="preserve">Los casos de uso describen las interacciones entre los actores del sistema y las funcionalidades disponibles. Los diagramas visuales se han generado con herramienta UML y se adjuntan a </w:t>
-      </w:r>
-      <w:r>
-        <w:rPr>
-          <w:color w:val="222222"/>
-        </w:rPr>
-        <w:t>continuación</w:t>
-      </w:r>
-      <w:r>
-        <w:rPr>
-          <w:color w:val="222222"/>
-        </w:rPr>
-        <w:t xml:space="preserve"> de cada </w:t>
-      </w:r>
-      <w:r>
-        <w:rPr>
-          <w:color w:val="222222"/>
-        </w:rPr>
-        <w:t>descripción</w:t>
-      </w:r>
-      <w:r>
-        <w:rPr>
-          <w:color w:val="222222"/>
-        </w:rPr>
-        <w:t>.</w:t>
+        <w:t>Los casos de uso describen las interacciones entre los actores del sistema y las funcionalidades disponibles. Los diagramas visuales se han generado con herramienta UML y se adjuntan a continuación de cada descripción.</w:t>
       </w:r>
     </w:p>
     <w:p>
@@ -4148,19 +3684,7 @@
               <w:rPr>
                 <w:color w:val="4472C4" w:themeColor="accent1"/>
               </w:rPr>
-              <w:t xml:space="preserve">Controla todo el sistema: usuarios, contenidos y </w:t>
-            </w:r>
-            <w:r>
-              <w:rPr>
-                <w:color w:val="4472C4" w:themeColor="accent1"/>
-              </w:rPr>
-              <w:t>estadísticas</w:t>
-            </w:r>
-            <w:r>
-              <w:rPr>
-                <w:color w:val="4472C4" w:themeColor="accent1"/>
-              </w:rPr>
-              <w:t xml:space="preserve"> globales.</w:t>
+              <w:t>Controla todo el sistema: usuarios, contenidos y estadísticas globales.</w:t>
             </w:r>
           </w:p>
         </w:tc>
@@ -4226,19 +3750,7 @@
               <w:rPr>
                 <w:color w:val="4472C4" w:themeColor="accent1"/>
               </w:rPr>
-              <w:t xml:space="preserve">Realiza acciones </w:t>
-            </w:r>
-            <w:r>
-              <w:rPr>
-                <w:color w:val="4472C4" w:themeColor="accent1"/>
-              </w:rPr>
-              <w:t>automáticas</w:t>
-            </w:r>
-            <w:r>
-              <w:rPr>
-                <w:color w:val="4472C4" w:themeColor="accent1"/>
-              </w:rPr>
-              <w:t>: calculo de progreso, registro de partidas.</w:t>
+              <w:t>Realiza acciones automáticas: calculo de progreso, registro de partidas.</w:t>
             </w:r>
           </w:p>
         </w:tc>
@@ -4271,7 +3783,7 @@
           <w:noProof/>
         </w:rPr>
         <w:drawing>
-          <wp:anchor distT="0" distB="0" distL="114300" distR="114300" simplePos="0" relativeHeight="251658240" behindDoc="1" locked="0" layoutInCell="1" allowOverlap="1" wp14:anchorId="1513581A" wp14:editId="30057116">
+          <wp:anchor distT="0" distB="0" distL="114300" distR="114300" simplePos="0" relativeHeight="251658240" behindDoc="1" locked="0" layoutInCell="1" allowOverlap="1" wp14:anchorId="1D5F77FE" wp14:editId="728B13E0">
             <wp:simplePos x="0" y="0"/>
             <wp:positionH relativeFrom="column">
               <wp:posOffset>-91440</wp:posOffset>
@@ -4401,13 +3913,7 @@
       </w:pPr>
       <w:r>
         <w:lastRenderedPageBreak/>
-        <w:t xml:space="preserve">4.3. </w:t>
-      </w:r>
-      <w:r>
-        <w:t>Descripción</w:t>
-      </w:r>
-      <w:r>
-        <w:t xml:space="preserve"> de los casos de uso principales</w:t>
+        <w:t>4.3. Descripción de los casos de uso principales</w:t>
       </w:r>
     </w:p>
     <w:p>
@@ -4708,31 +4214,7 @@
               <w:rPr>
                 <w:color w:val="4472C4" w:themeColor="accent1"/>
               </w:rPr>
-              <w:t xml:space="preserve">El usuario se registra o inicia </w:t>
-            </w:r>
-            <w:r>
-              <w:rPr>
-                <w:color w:val="4472C4" w:themeColor="accent1"/>
-              </w:rPr>
-              <w:t>sesión</w:t>
-            </w:r>
-            <w:r>
-              <w:rPr>
-                <w:color w:val="4472C4" w:themeColor="accent1"/>
-              </w:rPr>
-              <w:t xml:space="preserve">. El sistema valida los datos y redirige al panel correspondiente </w:t>
-            </w:r>
-            <w:r>
-              <w:rPr>
-                <w:color w:val="4472C4" w:themeColor="accent1"/>
-              </w:rPr>
-              <w:t>según</w:t>
-            </w:r>
-            <w:r>
-              <w:rPr>
-                <w:color w:val="4472C4" w:themeColor="accent1"/>
-              </w:rPr>
-              <w:t xml:space="preserve"> su rol.</w:t>
+              <w:t>El usuario se registra o inicia sesión. El sistema valida los datos y redirige al panel correspondiente según su rol.</w:t>
             </w:r>
           </w:p>
         </w:tc>
@@ -4798,19 +4280,7 @@
               <w:rPr>
                 <w:color w:val="4472C4" w:themeColor="accent1"/>
               </w:rPr>
-              <w:t xml:space="preserve">El usuario no tiene </w:t>
-            </w:r>
-            <w:r>
-              <w:rPr>
-                <w:color w:val="4472C4" w:themeColor="accent1"/>
-              </w:rPr>
-              <w:t>sesión</w:t>
-            </w:r>
-            <w:r>
-              <w:rPr>
-                <w:color w:val="4472C4" w:themeColor="accent1"/>
-              </w:rPr>
-              <w:t xml:space="preserve"> activa.</w:t>
+              <w:t>El usuario no tiene sesión activa.</w:t>
             </w:r>
           </w:p>
         </w:tc>
@@ -4901,19 +4371,7 @@
               <w:rPr>
                 <w:color w:val="4472C4" w:themeColor="accent1"/>
               </w:rPr>
-              <w:t xml:space="preserve">Introduce email y </w:t>
-            </w:r>
-            <w:r>
-              <w:rPr>
-                <w:color w:val="4472C4" w:themeColor="accent1"/>
-              </w:rPr>
-              <w:t>contraseña</w:t>
-            </w:r>
-            <w:r>
-              <w:rPr>
-                <w:color w:val="4472C4" w:themeColor="accent1"/>
-              </w:rPr>
-              <w:t>.</w:t>
+              <w:t>Introduce email y contraseña.</w:t>
             </w:r>
           </w:p>
           <w:p>
@@ -4951,19 +4409,7 @@
               <w:rPr>
                 <w:color w:val="4472C4" w:themeColor="accent1"/>
               </w:rPr>
-              <w:t xml:space="preserve">Si es correcto, crea la </w:t>
-            </w:r>
-            <w:r>
-              <w:rPr>
-                <w:color w:val="4472C4" w:themeColor="accent1"/>
-              </w:rPr>
-              <w:t>sesión</w:t>
-            </w:r>
-            <w:r>
-              <w:rPr>
-                <w:color w:val="4472C4" w:themeColor="accent1"/>
-              </w:rPr>
-              <w:t xml:space="preserve"> y redirige a su panel.</w:t>
+              <w:t>Si es correcto, crea la sesión y redirige a su panel.</w:t>
             </w:r>
           </w:p>
         </w:tc>
@@ -5146,23 +4592,7 @@
           <w:bCs/>
           <w:color w:val="222222"/>
         </w:rPr>
-        <w:t xml:space="preserve">CU-02 — Realizar </w:t>
-      </w:r>
-      <w:r>
-        <w:rPr>
-          <w:b/>
-          <w:bCs/>
-          <w:color w:val="222222"/>
-        </w:rPr>
-        <w:t>evaluación</w:t>
-      </w:r>
-      <w:r>
-        <w:rPr>
-          <w:b/>
-          <w:bCs/>
-          <w:color w:val="222222"/>
-        </w:rPr>
-        <w:t xml:space="preserve"> (trivial)</w:t>
+        <w:t>CU-02 — Realizar evaluación (trivial)</w:t>
       </w:r>
     </w:p>
     <w:tbl>
@@ -5313,13 +4743,7 @@
               <w:rPr>
                 <w:color w:val="4472C4" w:themeColor="accent1"/>
               </w:rPr>
-              <w:t xml:space="preserve">Realizar </w:t>
-            </w:r>
-            <w:r>
-              <w:rPr>
-                <w:color w:val="4472C4" w:themeColor="accent1"/>
-              </w:rPr>
-              <w:t>evaluación</w:t>
+              <w:t>Realizar evaluación</w:t>
             </w:r>
           </w:p>
         </w:tc>
@@ -5451,19 +4875,7 @@
               <w:rPr>
                 <w:color w:val="4472C4" w:themeColor="accent1"/>
               </w:rPr>
-              <w:t xml:space="preserve">El alumno selecciona un cuestionario, responde las preguntas dentro del tiempo </w:t>
-            </w:r>
-            <w:r>
-              <w:rPr>
-                <w:color w:val="4472C4" w:themeColor="accent1"/>
-              </w:rPr>
-              <w:t>límite</w:t>
-            </w:r>
-            <w:r>
-              <w:rPr>
-                <w:color w:val="4472C4" w:themeColor="accent1"/>
-              </w:rPr>
-              <w:t xml:space="preserve"> y el sistema registra el resultado.</w:t>
+              <w:t>El alumno selecciona un cuestionario, responde las preguntas dentro del tiempo límite y el sistema registra el resultado.</w:t>
             </w:r>
           </w:p>
         </w:tc>
@@ -5529,19 +4941,7 @@
               <w:rPr>
                 <w:color w:val="4472C4" w:themeColor="accent1"/>
               </w:rPr>
-              <w:t xml:space="preserve">El alumno tiene </w:t>
-            </w:r>
-            <w:r>
-              <w:rPr>
-                <w:color w:val="4472C4" w:themeColor="accent1"/>
-              </w:rPr>
-              <w:t>sesión</w:t>
-            </w:r>
-            <w:r>
-              <w:rPr>
-                <w:color w:val="4472C4" w:themeColor="accent1"/>
-              </w:rPr>
-              <w:t xml:space="preserve"> activa y acceso al curso.</w:t>
+              <w:t>El alumno tiene sesión activa y acceso al curso.</w:t>
             </w:r>
           </w:p>
         </w:tc>
@@ -5613,19 +5013,7 @@
               <w:rPr>
                 <w:color w:val="4472C4" w:themeColor="accent1"/>
               </w:rPr>
-              <w:t xml:space="preserve">El alumno selecciona una </w:t>
-            </w:r>
-            <w:r>
-              <w:rPr>
-                <w:color w:val="4472C4" w:themeColor="accent1"/>
-              </w:rPr>
-              <w:t>evaluación</w:t>
-            </w:r>
-            <w:r>
-              <w:rPr>
-                <w:color w:val="4472C4" w:themeColor="accent1"/>
-              </w:rPr>
-              <w:t>.</w:t>
+              <w:t>El alumno selecciona una evaluación.</w:t>
             </w:r>
           </w:p>
           <w:p>
@@ -5682,19 +5070,7 @@
               <w:rPr>
                 <w:color w:val="4472C4" w:themeColor="accent1"/>
               </w:rPr>
-              <w:t xml:space="preserve">El sistema calcula la </w:t>
-            </w:r>
-            <w:r>
-              <w:rPr>
-                <w:color w:val="4472C4" w:themeColor="accent1"/>
-              </w:rPr>
-              <w:t>puntuación</w:t>
-            </w:r>
-            <w:r>
-              <w:rPr>
-                <w:color w:val="4472C4" w:themeColor="accent1"/>
-              </w:rPr>
-              <w:t xml:space="preserve"> y la guarda en la tabla partidas.</w:t>
+              <w:t>El sistema calcula la puntuación y la guarda en la tabla partidas.</w:t>
             </w:r>
           </w:p>
           <w:p>
@@ -6318,19 +5694,7 @@
               <w:rPr>
                 <w:color w:val="4472C4" w:themeColor="accent1"/>
               </w:rPr>
-              <w:t xml:space="preserve">Accede al panel de </w:t>
-            </w:r>
-            <w:r>
-              <w:rPr>
-                <w:color w:val="4472C4" w:themeColor="accent1"/>
-              </w:rPr>
-              <w:t>gestión</w:t>
-            </w:r>
-            <w:r>
-              <w:rPr>
-                <w:color w:val="4472C4" w:themeColor="accent1"/>
-              </w:rPr>
-              <w:t>.</w:t>
+              <w:t>Accede al panel de gestión.</w:t>
             </w:r>
           </w:p>
           <w:p>
@@ -6349,31 +5713,7 @@
               <w:rPr>
                 <w:color w:val="4472C4" w:themeColor="accent1"/>
               </w:rPr>
-              <w:t xml:space="preserve">Crea o edita un curso con </w:t>
-            </w:r>
-            <w:r>
-              <w:rPr>
-                <w:color w:val="4472C4" w:themeColor="accent1"/>
-              </w:rPr>
-              <w:t>título</w:t>
-            </w:r>
-            <w:r>
-              <w:rPr>
-                <w:color w:val="4472C4" w:themeColor="accent1"/>
-              </w:rPr>
-              <w:t xml:space="preserve"> y </w:t>
-            </w:r>
-            <w:r>
-              <w:rPr>
-                <w:color w:val="4472C4" w:themeColor="accent1"/>
-              </w:rPr>
-              <w:t>categoría</w:t>
-            </w:r>
-            <w:r>
-              <w:rPr>
-                <w:color w:val="4472C4" w:themeColor="accent1"/>
-              </w:rPr>
-              <w:t>.</w:t>
+              <w:t>Crea o edita un curso con título y categoría.</w:t>
             </w:r>
           </w:p>
           <w:p>
@@ -6502,19 +5842,7 @@
               <w:rPr>
                 <w:color w:val="4472C4" w:themeColor="accent1"/>
               </w:rPr>
-              <w:t xml:space="preserve">Eliminar curso: </w:t>
-            </w:r>
-            <w:r>
-              <w:rPr>
-                <w:color w:val="4472C4" w:themeColor="accent1"/>
-              </w:rPr>
-              <w:t>confirmación</w:t>
-            </w:r>
-            <w:r>
-              <w:rPr>
-                <w:color w:val="4472C4" w:themeColor="accent1"/>
-              </w:rPr>
-              <w:t xml:space="preserve"> y borrado en cascada.</w:t>
+              <w:t>Eliminar curso: confirmación y borrado en cascada.</w:t>
             </w:r>
           </w:p>
           <w:p>
@@ -6776,19 +6104,7 @@
               <w:rPr>
                 <w:color w:val="4472C4" w:themeColor="accent1"/>
               </w:rPr>
-              <w:t xml:space="preserve">Consulta de datos </w:t>
-            </w:r>
-            <w:r>
-              <w:rPr>
-                <w:color w:val="4472C4" w:themeColor="accent1"/>
-              </w:rPr>
-              <w:t>vía</w:t>
-            </w:r>
-            <w:r>
-              <w:rPr>
-                <w:color w:val="4472C4" w:themeColor="accent1"/>
-              </w:rPr>
-              <w:t xml:space="preserve"> API REST</w:t>
+              <w:t>Consulta de datos vía API REST</w:t>
             </w:r>
           </w:p>
         </w:tc>
@@ -6986,19 +6302,7 @@
               <w:rPr>
                 <w:color w:val="4472C4" w:themeColor="accent1"/>
               </w:rPr>
-              <w:t xml:space="preserve">El usuario tiene </w:t>
-            </w:r>
-            <w:r>
-              <w:rPr>
-                <w:color w:val="4472C4" w:themeColor="accent1"/>
-              </w:rPr>
-              <w:t>sesión</w:t>
-            </w:r>
-            <w:r>
-              <w:rPr>
-                <w:color w:val="4472C4" w:themeColor="accent1"/>
-              </w:rPr>
-              <w:t xml:space="preserve"> activa.</w:t>
+              <w:t>El usuario tiene sesión activa.</w:t>
             </w:r>
           </w:p>
         </w:tc>
@@ -7070,19 +6374,7 @@
               <w:rPr>
                 <w:color w:val="4472C4" w:themeColor="accent1"/>
               </w:rPr>
-              <w:t xml:space="preserve">El JS hace una </w:t>
-            </w:r>
-            <w:r>
-              <w:rPr>
-                <w:color w:val="4472C4" w:themeColor="accent1"/>
-              </w:rPr>
-              <w:t>petición</w:t>
-            </w:r>
-            <w:r>
-              <w:rPr>
-                <w:color w:val="4472C4" w:themeColor="accent1"/>
-              </w:rPr>
-              <w:t xml:space="preserve"> GET o POST a /api/...</w:t>
+              <w:t>El JS hace una petición GET o POST a /api/...</w:t>
             </w:r>
           </w:p>
           <w:p>
@@ -7101,19 +6393,7 @@
               <w:rPr>
                 <w:color w:val="4472C4" w:themeColor="accent1"/>
               </w:rPr>
-              <w:t xml:space="preserve">El ApiController comprueba que existe </w:t>
-            </w:r>
-            <w:r>
-              <w:rPr>
-                <w:color w:val="4472C4" w:themeColor="accent1"/>
-              </w:rPr>
-              <w:t>sesión</w:t>
-            </w:r>
-            <w:r>
-              <w:rPr>
-                <w:color w:val="4472C4" w:themeColor="accent1"/>
-              </w:rPr>
-              <w:t xml:space="preserve"> valida.</w:t>
+              <w:t>El ApiController comprueba que existe sesión valida.</w:t>
             </w:r>
           </w:p>
           <w:p>
@@ -7151,19 +6431,7 @@
               <w:rPr>
                 <w:color w:val="4472C4" w:themeColor="accent1"/>
               </w:rPr>
-              <w:t xml:space="preserve">Devuelve la respuesta en JSON con el </w:t>
-            </w:r>
-            <w:r>
-              <w:rPr>
-                <w:color w:val="4472C4" w:themeColor="accent1"/>
-              </w:rPr>
-              <w:t>código</w:t>
-            </w:r>
-            <w:r>
-              <w:rPr>
-                <w:color w:val="4472C4" w:themeColor="accent1"/>
-              </w:rPr>
-              <w:t xml:space="preserve"> HTTP correspondiente.</w:t>
+              <w:t>Devuelve la respuesta en JSON con el código HTTP correspondiente.</w:t>
             </w:r>
           </w:p>
         </w:tc>
@@ -7235,19 +6503,7 @@
               <w:rPr>
                 <w:color w:val="4472C4" w:themeColor="accent1"/>
               </w:rPr>
-              <w:t xml:space="preserve">Sin </w:t>
-            </w:r>
-            <w:r>
-              <w:rPr>
-                <w:color w:val="4472C4" w:themeColor="accent1"/>
-              </w:rPr>
-              <w:t>sesión</w:t>
-            </w:r>
-            <w:r>
-              <w:rPr>
-                <w:color w:val="4472C4" w:themeColor="accent1"/>
-              </w:rPr>
-              <w:t xml:space="preserve"> activa: responde 401 Unauthorized.</w:t>
+              <w:t>Sin sesión activa: responde 401 Unauthorized.</w:t>
             </w:r>
           </w:p>
           <w:p>
@@ -7365,43 +6621,7 @@
         <w:rPr>
           <w:color w:val="222222"/>
         </w:rPr>
-        <w:t xml:space="preserve">Los diagramas de secuencia representan la </w:t>
-      </w:r>
-      <w:r>
-        <w:rPr>
-          <w:color w:val="222222"/>
-        </w:rPr>
-        <w:t>comunicación</w:t>
-      </w:r>
-      <w:r>
-        <w:rPr>
-          <w:color w:val="222222"/>
-        </w:rPr>
-        <w:t xml:space="preserve"> entre los distintos componentes del sistema en los flujos </w:t>
-      </w:r>
-      <w:r>
-        <w:rPr>
-          <w:color w:val="222222"/>
-        </w:rPr>
-        <w:t>más</w:t>
-      </w:r>
-      <w:r>
-        <w:rPr>
-          <w:color w:val="222222"/>
-        </w:rPr>
-        <w:t xml:space="preserve"> relevantes. Las </w:t>
-      </w:r>
-      <w:r>
-        <w:rPr>
-          <w:color w:val="222222"/>
-        </w:rPr>
-        <w:t>imágenes</w:t>
-      </w:r>
-      <w:r>
-        <w:rPr>
-          <w:color w:val="222222"/>
-        </w:rPr>
-        <w:t xml:space="preserve"> se han generado con herramienta UML.</w:t>
+        <w:t>Los diagramas de secuencia representan la comunicación entre los distintos componentes del sistema en los flujos más relevantes. Las imágenes se han generado con herramienta UML.</w:t>
       </w:r>
     </w:p>
     <w:p>
@@ -7426,7 +6646,7 @@
           <w:noProof/>
         </w:rPr>
         <w:drawing>
-          <wp:anchor distT="0" distB="0" distL="114300" distR="114300" simplePos="0" relativeHeight="251659264" behindDoc="1" locked="0" layoutInCell="1" allowOverlap="1" wp14:anchorId="6CAE8049" wp14:editId="779F1369">
+          <wp:anchor distT="0" distB="0" distL="114300" distR="114300" simplePos="0" relativeHeight="251659264" behindDoc="1" locked="0" layoutInCell="1" allowOverlap="1" wp14:anchorId="5C8678F3" wp14:editId="2DDAF6CB">
             <wp:simplePos x="0" y="0"/>
             <wp:positionH relativeFrom="column">
               <wp:posOffset>0</wp:posOffset>
@@ -7568,31 +6788,7 @@
         <w:rPr>
           <w:color w:val="222222"/>
         </w:rPr>
-        <w:t xml:space="preserve">Si las credenciales son </w:t>
-      </w:r>
-      <w:r>
-        <w:rPr>
-          <w:color w:val="222222"/>
-        </w:rPr>
-        <w:t>válidas</w:t>
-      </w:r>
-      <w:r>
-        <w:rPr>
-          <w:color w:val="222222"/>
-        </w:rPr>
-        <w:t xml:space="preserve">, se crea la </w:t>
-      </w:r>
-      <w:r>
-        <w:rPr>
-          <w:color w:val="222222"/>
-        </w:rPr>
-        <w:t>sesión</w:t>
-      </w:r>
-      <w:r>
-        <w:rPr>
-          <w:color w:val="222222"/>
-        </w:rPr>
-        <w:t xml:space="preserve"> y se redirige al panel.</w:t>
+        <w:t>Si las credenciales son válidas, se crea la sesión y se redirige al panel.</w:t>
       </w:r>
     </w:p>
     <w:p>
@@ -7641,7 +6837,7 @@
         </w:rPr>
         <w:lastRenderedPageBreak/>
         <w:drawing>
-          <wp:anchor distT="0" distB="0" distL="114300" distR="114300" simplePos="0" relativeHeight="251660288" behindDoc="1" locked="0" layoutInCell="1" allowOverlap="1" wp14:anchorId="2C5F82E0" wp14:editId="09A69DDF">
+          <wp:anchor distT="0" distB="0" distL="114300" distR="114300" simplePos="0" relativeHeight="251660288" behindDoc="1" locked="0" layoutInCell="1" allowOverlap="1" wp14:anchorId="443A8E88" wp14:editId="157AC782">
             <wp:simplePos x="0" y="0"/>
             <wp:positionH relativeFrom="column">
               <wp:posOffset>-167640</wp:posOffset>
@@ -7699,13 +6895,7 @@
         </w:drawing>
       </w:r>
       <w:r>
-        <w:t xml:space="preserve">5.2. Realizar </w:t>
-      </w:r>
-      <w:r>
-        <w:t>evaluación</w:t>
-      </w:r>
-      <w:r>
-        <w:t xml:space="preserve"> (trivial)</w:t>
+        <w:t>5.2. Realizar evaluación (trivial)</w:t>
       </w:r>
     </w:p>
     <w:p>
@@ -7791,31 +6981,7 @@
         <w:rPr>
           <w:color w:val="222222"/>
         </w:rPr>
-        <w:t xml:space="preserve">El alumno responde cada pregunta. El JS </w:t>
-      </w:r>
-      <w:r>
-        <w:rPr>
-          <w:color w:val="222222"/>
-        </w:rPr>
-        <w:t>envía</w:t>
-      </w:r>
-      <w:r>
-        <w:rPr>
-          <w:color w:val="222222"/>
-        </w:rPr>
-        <w:t xml:space="preserve"> la respuesta </w:t>
-      </w:r>
-      <w:r>
-        <w:rPr>
-          <w:color w:val="222222"/>
-        </w:rPr>
-        <w:t>vía</w:t>
-      </w:r>
-      <w:r>
-        <w:rPr>
-          <w:color w:val="222222"/>
-        </w:rPr>
-        <w:t xml:space="preserve"> fetch.</w:t>
+        <w:t>El alumno responde cada pregunta. El JS envía la respuesta vía fetch.</w:t>
       </w:r>
     </w:p>
     <w:p>
@@ -7831,19 +6997,7 @@
         <w:rPr>
           <w:color w:val="222222"/>
         </w:rPr>
-        <w:t xml:space="preserve">Al terminar, el JS </w:t>
-      </w:r>
-      <w:r>
-        <w:rPr>
-          <w:color w:val="222222"/>
-        </w:rPr>
-        <w:t>envía</w:t>
-      </w:r>
-      <w:r>
-        <w:rPr>
-          <w:color w:val="222222"/>
-        </w:rPr>
-        <w:t xml:space="preserve"> el resultado a /api/partidas.</w:t>
+        <w:t>Al terminar, el JS envía el resultado a /api/partidas.</w:t>
       </w:r>
     </w:p>
     <w:p>
@@ -7925,7 +7079,7 @@
           <w:noProof/>
         </w:rPr>
         <w:drawing>
-          <wp:anchor distT="0" distB="0" distL="114300" distR="114300" simplePos="0" relativeHeight="251661312" behindDoc="1" locked="0" layoutInCell="1" allowOverlap="1" wp14:anchorId="43197A5D" wp14:editId="413990CF">
+          <wp:anchor distT="0" distB="0" distL="114300" distR="114300" simplePos="0" relativeHeight="251661312" behindDoc="1" locked="0" layoutInCell="1" allowOverlap="1" wp14:anchorId="22448060" wp14:editId="38FD948E">
             <wp:simplePos x="0" y="0"/>
             <wp:positionH relativeFrom="column">
               <wp:posOffset>0</wp:posOffset>
@@ -8008,19 +7162,7 @@
         <w:rPr>
           <w:color w:val="222222"/>
         </w:rPr>
-        <w:t xml:space="preserve">El profesor/admin accede al panel de </w:t>
-      </w:r>
-      <w:r>
-        <w:rPr>
-          <w:color w:val="222222"/>
-        </w:rPr>
-        <w:t>administración</w:t>
-      </w:r>
-      <w:r>
-        <w:rPr>
-          <w:color w:val="222222"/>
-        </w:rPr>
-        <w:t>.</w:t>
+        <w:t>El profesor/admin accede al panel de administración.</w:t>
       </w:r>
     </w:p>
     <w:p>
@@ -8036,31 +7178,7 @@
         <w:rPr>
           <w:color w:val="222222"/>
         </w:rPr>
-        <w:t xml:space="preserve">Rellena el formulario de nuevo curso y lo </w:t>
-      </w:r>
-      <w:r>
-        <w:rPr>
-          <w:color w:val="222222"/>
-        </w:rPr>
-        <w:t>envía</w:t>
-      </w:r>
-      <w:r>
-        <w:rPr>
-          <w:color w:val="222222"/>
-        </w:rPr>
-        <w:t xml:space="preserve"> </w:t>
-      </w:r>
-      <w:r>
-        <w:rPr>
-          <w:color w:val="222222"/>
-        </w:rPr>
-        <w:t>vía</w:t>
-      </w:r>
-      <w:r>
-        <w:rPr>
-          <w:color w:val="222222"/>
-        </w:rPr>
-        <w:t xml:space="preserve"> POST.</w:t>
+        <w:t>Rellena el formulario de nuevo curso y lo envía vía POST.</w:t>
       </w:r>
     </w:p>
     <w:p>
@@ -8122,31 +7240,7 @@
         <w:rPr>
           <w:color w:val="222222"/>
         </w:rPr>
-        <w:t xml:space="preserve">El modelo de datos esta </w:t>
-      </w:r>
-      <w:r>
-        <w:rPr>
-          <w:color w:val="222222"/>
-        </w:rPr>
-        <w:t>diseñado</w:t>
-      </w:r>
-      <w:r>
-        <w:rPr>
-          <w:color w:val="222222"/>
-        </w:rPr>
-        <w:t xml:space="preserve"> para PostgreSQL. Se emplean tipos nativos como SERIAL, TIMESTAMPTZ y BOOLEAN, claves </w:t>
-      </w:r>
-      <w:r>
-        <w:rPr>
-          <w:color w:val="222222"/>
-        </w:rPr>
-        <w:t>foráneas</w:t>
-      </w:r>
-      <w:r>
-        <w:rPr>
-          <w:color w:val="222222"/>
-        </w:rPr>
-        <w:t xml:space="preserve"> con integridad referencial y restricciones CHECK en los campos con valores acotados.</w:t>
+        <w:t>El modelo de datos esta diseñado para PostgreSQL. Se emplean tipos nativos como SERIAL, TIMESTAMPTZ y BOOLEAN, claves foráneas con integridad referencial y restricciones CHECK en los campos con valores acotados.</w:t>
       </w:r>
     </w:p>
     <w:p>
@@ -8457,23 +7551,7 @@
                 <w:sz w:val="19"/>
                 <w:szCs w:val="19"/>
               </w:rPr>
-              <w:t xml:space="preserve">Identificador </w:t>
-            </w:r>
-            <w:r>
-              <w:rPr>
-                <w:color w:val="4472C4" w:themeColor="accent1"/>
-                <w:sz w:val="19"/>
-                <w:szCs w:val="19"/>
-              </w:rPr>
-              <w:t>único</w:t>
-            </w:r>
-            <w:r>
-              <w:rPr>
-                <w:color w:val="4472C4" w:themeColor="accent1"/>
-                <w:sz w:val="19"/>
-                <w:szCs w:val="19"/>
-              </w:rPr>
-              <w:t xml:space="preserve"> del usuario</w:t>
+              <w:t>Identificador único del usuario</w:t>
             </w:r>
           </w:p>
         </w:tc>
@@ -9591,23 +8669,141 @@
                 <w:sz w:val="19"/>
                 <w:szCs w:val="19"/>
               </w:rPr>
-              <w:t xml:space="preserve">Identificador </w:t>
-            </w:r>
+              <w:t>Identificador único del curso</w:t>
+            </w:r>
+          </w:p>
+        </w:tc>
+      </w:tr>
+      <w:tr>
+        <w:tc>
+          <w:tcPr>
+            <w:tcW w:w="2300" w:type="dxa"/>
+            <w:tcBorders>
+              <w:top w:val="single" w:sz="1" w:space="0" w:color="888888"/>
+              <w:left w:val="single" w:sz="1" w:space="0" w:color="888888"/>
+              <w:bottom w:val="single" w:sz="1" w:space="0" w:color="888888"/>
+              <w:right w:val="single" w:sz="1" w:space="0" w:color="888888"/>
+            </w:tcBorders>
+            <w:shd w:val="clear" w:color="auto" w:fill="F8F8F8"/>
+            <w:tcMar>
+              <w:top w:w="70" w:type="dxa"/>
+              <w:left w:w="120" w:type="dxa"/>
+              <w:bottom w:w="70" w:type="dxa"/>
+              <w:right w:w="120" w:type="dxa"/>
+            </w:tcMar>
+          </w:tcPr>
+          <w:p>
+            <w:pPr>
+              <w:rPr>
+                <w:color w:val="4472C4" w:themeColor="accent1"/>
+              </w:rPr>
+            </w:pPr>
             <w:r>
               <w:rPr>
                 <w:color w:val="4472C4" w:themeColor="accent1"/>
                 <w:sz w:val="19"/>
                 <w:szCs w:val="19"/>
               </w:rPr>
-              <w:t>único</w:t>
-            </w:r>
+              <w:t>titulo</w:t>
+            </w:r>
+          </w:p>
+        </w:tc>
+        <w:tc>
+          <w:tcPr>
+            <w:tcW w:w="1900" w:type="dxa"/>
+            <w:tcBorders>
+              <w:top w:val="single" w:sz="1" w:space="0" w:color="888888"/>
+              <w:left w:val="single" w:sz="1" w:space="0" w:color="888888"/>
+              <w:bottom w:val="single" w:sz="1" w:space="0" w:color="888888"/>
+              <w:right w:val="single" w:sz="1" w:space="0" w:color="888888"/>
+            </w:tcBorders>
+            <w:shd w:val="clear" w:color="auto" w:fill="F8F8F8"/>
+            <w:tcMar>
+              <w:top w:w="70" w:type="dxa"/>
+              <w:left w:w="120" w:type="dxa"/>
+              <w:bottom w:w="70" w:type="dxa"/>
+              <w:right w:w="120" w:type="dxa"/>
+            </w:tcMar>
+          </w:tcPr>
+          <w:p>
+            <w:pPr>
+              <w:rPr>
+                <w:color w:val="4472C4" w:themeColor="accent1"/>
+              </w:rPr>
+            </w:pPr>
             <w:r>
               <w:rPr>
                 <w:color w:val="4472C4" w:themeColor="accent1"/>
                 <w:sz w:val="19"/>
                 <w:szCs w:val="19"/>
               </w:rPr>
-              <w:t xml:space="preserve"> del curso</w:t>
+              <w:t>VARCHAR(200)</w:t>
+            </w:r>
+          </w:p>
+        </w:tc>
+        <w:tc>
+          <w:tcPr>
+            <w:tcW w:w="1700" w:type="dxa"/>
+            <w:tcBorders>
+              <w:top w:val="single" w:sz="1" w:space="0" w:color="888888"/>
+              <w:left w:val="single" w:sz="1" w:space="0" w:color="888888"/>
+              <w:bottom w:val="single" w:sz="1" w:space="0" w:color="888888"/>
+              <w:right w:val="single" w:sz="1" w:space="0" w:color="888888"/>
+            </w:tcBorders>
+            <w:shd w:val="clear" w:color="auto" w:fill="F8F8F8"/>
+            <w:tcMar>
+              <w:top w:w="70" w:type="dxa"/>
+              <w:left w:w="120" w:type="dxa"/>
+              <w:bottom w:w="70" w:type="dxa"/>
+              <w:right w:w="120" w:type="dxa"/>
+            </w:tcMar>
+          </w:tcPr>
+          <w:p>
+            <w:pPr>
+              <w:rPr>
+                <w:color w:val="4472C4" w:themeColor="accent1"/>
+              </w:rPr>
+            </w:pPr>
+            <w:r>
+              <w:rPr>
+                <w:color w:val="4472C4" w:themeColor="accent1"/>
+                <w:sz w:val="19"/>
+                <w:szCs w:val="19"/>
+              </w:rPr>
+              <w:t>NOT NULL</w:t>
+            </w:r>
+          </w:p>
+        </w:tc>
+        <w:tc>
+          <w:tcPr>
+            <w:tcW w:w="3126" w:type="dxa"/>
+            <w:tcBorders>
+              <w:top w:val="single" w:sz="1" w:space="0" w:color="888888"/>
+              <w:left w:val="single" w:sz="1" w:space="0" w:color="888888"/>
+              <w:bottom w:val="single" w:sz="1" w:space="0" w:color="888888"/>
+              <w:right w:val="single" w:sz="1" w:space="0" w:color="888888"/>
+            </w:tcBorders>
+            <w:shd w:val="clear" w:color="auto" w:fill="F8F8F8"/>
+            <w:tcMar>
+              <w:top w:w="70" w:type="dxa"/>
+              <w:left w:w="120" w:type="dxa"/>
+              <w:bottom w:w="70" w:type="dxa"/>
+              <w:right w:w="120" w:type="dxa"/>
+            </w:tcMar>
+          </w:tcPr>
+          <w:p>
+            <w:pPr>
+              <w:rPr>
+                <w:color w:val="4472C4" w:themeColor="accent1"/>
+              </w:rPr>
+            </w:pPr>
+            <w:r>
+              <w:rPr>
+                <w:color w:val="4472C4" w:themeColor="accent1"/>
+                <w:sz w:val="19"/>
+                <w:szCs w:val="19"/>
+              </w:rPr>
+              <w:t>Título del curso</w:t>
             </w:r>
           </w:p>
         </w:tc>
@@ -9622,7 +8818,7 @@
               <w:bottom w:val="single" w:sz="1" w:space="0" w:color="888888"/>
               <w:right w:val="single" w:sz="1" w:space="0" w:color="888888"/>
             </w:tcBorders>
-            <w:shd w:val="clear" w:color="auto" w:fill="F8F8F8"/>
+            <w:shd w:val="clear" w:color="auto" w:fill="FFFFFF"/>
             <w:tcMar>
               <w:top w:w="70" w:type="dxa"/>
               <w:left w:w="120" w:type="dxa"/>
@@ -9642,7 +8838,7 @@
                 <w:sz w:val="19"/>
                 <w:szCs w:val="19"/>
               </w:rPr>
-              <w:t>titulo</w:t>
+              <w:t>descripción</w:t>
             </w:r>
           </w:p>
         </w:tc>
@@ -9655,7 +8851,7 @@
               <w:bottom w:val="single" w:sz="1" w:space="0" w:color="888888"/>
               <w:right w:val="single" w:sz="1" w:space="0" w:color="888888"/>
             </w:tcBorders>
-            <w:shd w:val="clear" w:color="auto" w:fill="F8F8F8"/>
+            <w:shd w:val="clear" w:color="auto" w:fill="FFFFFF"/>
             <w:tcMar>
               <w:top w:w="70" w:type="dxa"/>
               <w:left w:w="120" w:type="dxa"/>
@@ -9675,7 +8871,7 @@
                 <w:sz w:val="19"/>
                 <w:szCs w:val="19"/>
               </w:rPr>
-              <w:t>VARCHAR(200)</w:t>
+              <w:t>TEXT</w:t>
             </w:r>
           </w:p>
         </w:tc>
@@ -9688,7 +8884,32 @@
               <w:bottom w:val="single" w:sz="1" w:space="0" w:color="888888"/>
               <w:right w:val="single" w:sz="1" w:space="0" w:color="888888"/>
             </w:tcBorders>
-            <w:shd w:val="clear" w:color="auto" w:fill="F8F8F8"/>
+            <w:shd w:val="clear" w:color="auto" w:fill="FFFFFF"/>
+            <w:tcMar>
+              <w:top w:w="70" w:type="dxa"/>
+              <w:left w:w="120" w:type="dxa"/>
+              <w:bottom w:w="70" w:type="dxa"/>
+              <w:right w:w="120" w:type="dxa"/>
+            </w:tcMar>
+          </w:tcPr>
+          <w:p>
+            <w:pPr>
+              <w:rPr>
+                <w:color w:val="4472C4" w:themeColor="accent1"/>
+              </w:rPr>
+            </w:pPr>
+          </w:p>
+        </w:tc>
+        <w:tc>
+          <w:tcPr>
+            <w:tcW w:w="3126" w:type="dxa"/>
+            <w:tcBorders>
+              <w:top w:val="single" w:sz="1" w:space="0" w:color="888888"/>
+              <w:left w:val="single" w:sz="1" w:space="0" w:color="888888"/>
+              <w:bottom w:val="single" w:sz="1" w:space="0" w:color="888888"/>
+              <w:right w:val="single" w:sz="1" w:space="0" w:color="888888"/>
+            </w:tcBorders>
+            <w:shd w:val="clear" w:color="auto" w:fill="FFFFFF"/>
             <w:tcMar>
               <w:top w:w="70" w:type="dxa"/>
               <w:left w:w="120" w:type="dxa"/>
@@ -9708,13 +8929,15 @@
                 <w:sz w:val="19"/>
                 <w:szCs w:val="19"/>
               </w:rPr>
-              <w:t>NOT NULL</w:t>
-            </w:r>
-          </w:p>
-        </w:tc>
-        <w:tc>
-          <w:tcPr>
-            <w:tcW w:w="3126" w:type="dxa"/>
+              <w:t>Descripción detallada</w:t>
+            </w:r>
+          </w:p>
+        </w:tc>
+      </w:tr>
+      <w:tr>
+        <w:tc>
+          <w:tcPr>
+            <w:tcW w:w="2300" w:type="dxa"/>
             <w:tcBorders>
               <w:top w:val="single" w:sz="1" w:space="0" w:color="888888"/>
               <w:left w:val="single" w:sz="1" w:space="0" w:color="888888"/>
@@ -9741,7 +8964,106 @@
                 <w:sz w:val="19"/>
                 <w:szCs w:val="19"/>
               </w:rPr>
-              <w:t>Título del curso</w:t>
+              <w:t>categoría</w:t>
+            </w:r>
+          </w:p>
+        </w:tc>
+        <w:tc>
+          <w:tcPr>
+            <w:tcW w:w="1900" w:type="dxa"/>
+            <w:tcBorders>
+              <w:top w:val="single" w:sz="1" w:space="0" w:color="888888"/>
+              <w:left w:val="single" w:sz="1" w:space="0" w:color="888888"/>
+              <w:bottom w:val="single" w:sz="1" w:space="0" w:color="888888"/>
+              <w:right w:val="single" w:sz="1" w:space="0" w:color="888888"/>
+            </w:tcBorders>
+            <w:shd w:val="clear" w:color="auto" w:fill="F8F8F8"/>
+            <w:tcMar>
+              <w:top w:w="70" w:type="dxa"/>
+              <w:left w:w="120" w:type="dxa"/>
+              <w:bottom w:w="70" w:type="dxa"/>
+              <w:right w:w="120" w:type="dxa"/>
+            </w:tcMar>
+          </w:tcPr>
+          <w:p>
+            <w:pPr>
+              <w:rPr>
+                <w:color w:val="4472C4" w:themeColor="accent1"/>
+              </w:rPr>
+            </w:pPr>
+            <w:r>
+              <w:rPr>
+                <w:color w:val="4472C4" w:themeColor="accent1"/>
+                <w:sz w:val="19"/>
+                <w:szCs w:val="19"/>
+              </w:rPr>
+              <w:t>VARCHAR(50)</w:t>
+            </w:r>
+          </w:p>
+        </w:tc>
+        <w:tc>
+          <w:tcPr>
+            <w:tcW w:w="1700" w:type="dxa"/>
+            <w:tcBorders>
+              <w:top w:val="single" w:sz="1" w:space="0" w:color="888888"/>
+              <w:left w:val="single" w:sz="1" w:space="0" w:color="888888"/>
+              <w:bottom w:val="single" w:sz="1" w:space="0" w:color="888888"/>
+              <w:right w:val="single" w:sz="1" w:space="0" w:color="888888"/>
+            </w:tcBorders>
+            <w:shd w:val="clear" w:color="auto" w:fill="F8F8F8"/>
+            <w:tcMar>
+              <w:top w:w="70" w:type="dxa"/>
+              <w:left w:w="120" w:type="dxa"/>
+              <w:bottom w:w="70" w:type="dxa"/>
+              <w:right w:w="120" w:type="dxa"/>
+            </w:tcMar>
+          </w:tcPr>
+          <w:p>
+            <w:pPr>
+              <w:rPr>
+                <w:color w:val="4472C4" w:themeColor="accent1"/>
+              </w:rPr>
+            </w:pPr>
+            <w:r>
+              <w:rPr>
+                <w:color w:val="4472C4" w:themeColor="accent1"/>
+                <w:sz w:val="19"/>
+                <w:szCs w:val="19"/>
+              </w:rPr>
+              <w:t>NOT NULL</w:t>
+            </w:r>
+          </w:p>
+        </w:tc>
+        <w:tc>
+          <w:tcPr>
+            <w:tcW w:w="3126" w:type="dxa"/>
+            <w:tcBorders>
+              <w:top w:val="single" w:sz="1" w:space="0" w:color="888888"/>
+              <w:left w:val="single" w:sz="1" w:space="0" w:color="888888"/>
+              <w:bottom w:val="single" w:sz="1" w:space="0" w:color="888888"/>
+              <w:right w:val="single" w:sz="1" w:space="0" w:color="888888"/>
+            </w:tcBorders>
+            <w:shd w:val="clear" w:color="auto" w:fill="F8F8F8"/>
+            <w:tcMar>
+              <w:top w:w="70" w:type="dxa"/>
+              <w:left w:w="120" w:type="dxa"/>
+              <w:bottom w:w="70" w:type="dxa"/>
+              <w:right w:w="120" w:type="dxa"/>
+            </w:tcMar>
+          </w:tcPr>
+          <w:p>
+            <w:pPr>
+              <w:rPr>
+                <w:color w:val="4472C4" w:themeColor="accent1"/>
+              </w:rPr>
+            </w:pPr>
+            <w:r>
+              <w:rPr>
+                <w:color w:val="4472C4" w:themeColor="accent1"/>
+                <w:sz w:val="19"/>
+                <w:szCs w:val="19"/>
+              </w:rPr>
+              <w:t>Historia / Geografía / Mixto</w:t>
             </w:r>
           </w:p>
         </w:tc>
@@ -9776,7 +9098,7 @@
                 <w:sz w:val="19"/>
                 <w:szCs w:val="19"/>
               </w:rPr>
-              <w:t>descripción</w:t>
+              <w:t>profesor_id</w:t>
             </w:r>
           </w:p>
         </w:tc>
@@ -9809,38 +9131,13 @@
                 <w:sz w:val="19"/>
                 <w:szCs w:val="19"/>
               </w:rPr>
-              <w:t>TEXT</w:t>
+              <w:t>INTEGER</w:t>
             </w:r>
           </w:p>
         </w:tc>
         <w:tc>
           <w:tcPr>
             <w:tcW w:w="1700" w:type="dxa"/>
-            <w:tcBorders>
-              <w:top w:val="single" w:sz="1" w:space="0" w:color="888888"/>
-              <w:left w:val="single" w:sz="1" w:space="0" w:color="888888"/>
-              <w:bottom w:val="single" w:sz="1" w:space="0" w:color="888888"/>
-              <w:right w:val="single" w:sz="1" w:space="0" w:color="888888"/>
-            </w:tcBorders>
-            <w:shd w:val="clear" w:color="auto" w:fill="FFFFFF"/>
-            <w:tcMar>
-              <w:top w:w="70" w:type="dxa"/>
-              <w:left w:w="120" w:type="dxa"/>
-              <w:bottom w:w="70" w:type="dxa"/>
-              <w:right w:w="120" w:type="dxa"/>
-            </w:tcMar>
-          </w:tcPr>
-          <w:p>
-            <w:pPr>
-              <w:rPr>
-                <w:color w:val="4472C4" w:themeColor="accent1"/>
-              </w:rPr>
-            </w:pPr>
-          </w:p>
-        </w:tc>
-        <w:tc>
-          <w:tcPr>
-            <w:tcW w:w="3126" w:type="dxa"/>
             <w:tcBorders>
               <w:top w:val="single" w:sz="1" w:space="0" w:color="888888"/>
               <w:left w:val="single" w:sz="1" w:space="0" w:color="888888"/>
@@ -9867,7 +9164,40 @@
                 <w:sz w:val="19"/>
                 <w:szCs w:val="19"/>
               </w:rPr>
-              <w:t>Descripción detallada</w:t>
+              <w:t>FK → usuarios(id)</w:t>
+            </w:r>
+          </w:p>
+        </w:tc>
+        <w:tc>
+          <w:tcPr>
+            <w:tcW w:w="3126" w:type="dxa"/>
+            <w:tcBorders>
+              <w:top w:val="single" w:sz="1" w:space="0" w:color="888888"/>
+              <w:left w:val="single" w:sz="1" w:space="0" w:color="888888"/>
+              <w:bottom w:val="single" w:sz="1" w:space="0" w:color="888888"/>
+              <w:right w:val="single" w:sz="1" w:space="0" w:color="888888"/>
+            </w:tcBorders>
+            <w:shd w:val="clear" w:color="auto" w:fill="FFFFFF"/>
+            <w:tcMar>
+              <w:top w:w="70" w:type="dxa"/>
+              <w:left w:w="120" w:type="dxa"/>
+              <w:bottom w:w="70" w:type="dxa"/>
+              <w:right w:w="120" w:type="dxa"/>
+            </w:tcMar>
+          </w:tcPr>
+          <w:p>
+            <w:pPr>
+              <w:rPr>
+                <w:color w:val="4472C4" w:themeColor="accent1"/>
+              </w:rPr>
+            </w:pPr>
+            <w:r>
+              <w:rPr>
+                <w:color w:val="4472C4" w:themeColor="accent1"/>
+                <w:sz w:val="19"/>
+                <w:szCs w:val="19"/>
+              </w:rPr>
+              <w:t>Profesor responsable del curso</w:t>
             </w:r>
           </w:p>
         </w:tc>
@@ -9902,7 +9232,7 @@
                 <w:sz w:val="19"/>
                 <w:szCs w:val="19"/>
               </w:rPr>
-              <w:t>categoría</w:t>
+              <w:t>publicado</w:t>
             </w:r>
           </w:p>
         </w:tc>
@@ -9935,7 +9265,7 @@
                 <w:sz w:val="19"/>
                 <w:szCs w:val="19"/>
               </w:rPr>
-              <w:t>VARCHAR(50)</w:t>
+              <w:t>BOOLEAN</w:t>
             </w:r>
           </w:p>
         </w:tc>
@@ -9968,7 +9298,7 @@
                 <w:sz w:val="19"/>
                 <w:szCs w:val="19"/>
               </w:rPr>
-              <w:t>NOT NULL</w:t>
+              <w:t>DEFAULT false</w:t>
             </w:r>
           </w:p>
         </w:tc>
@@ -10001,31 +9331,81 @@
                 <w:sz w:val="19"/>
                 <w:szCs w:val="19"/>
               </w:rPr>
-              <w:t xml:space="preserve">Historia / </w:t>
-            </w:r>
+              <w:t>Si es visible para los alumnos</w:t>
+            </w:r>
+          </w:p>
+        </w:tc>
+      </w:tr>
+      <w:tr>
+        <w:tc>
+          <w:tcPr>
+            <w:tcW w:w="2300" w:type="dxa"/>
+            <w:tcBorders>
+              <w:top w:val="single" w:sz="1" w:space="0" w:color="888888"/>
+              <w:left w:val="single" w:sz="1" w:space="0" w:color="888888"/>
+              <w:bottom w:val="single" w:sz="1" w:space="0" w:color="888888"/>
+              <w:right w:val="single" w:sz="1" w:space="0" w:color="888888"/>
+            </w:tcBorders>
+            <w:shd w:val="clear" w:color="auto" w:fill="FFFFFF"/>
+            <w:tcMar>
+              <w:top w:w="70" w:type="dxa"/>
+              <w:left w:w="120" w:type="dxa"/>
+              <w:bottom w:w="70" w:type="dxa"/>
+              <w:right w:w="120" w:type="dxa"/>
+            </w:tcMar>
+          </w:tcPr>
+          <w:p>
+            <w:pPr>
+              <w:rPr>
+                <w:color w:val="4472C4" w:themeColor="accent1"/>
+              </w:rPr>
+            </w:pPr>
             <w:r>
               <w:rPr>
                 <w:color w:val="4472C4" w:themeColor="accent1"/>
                 <w:sz w:val="19"/>
                 <w:szCs w:val="19"/>
               </w:rPr>
-              <w:t>Geografía</w:t>
-            </w:r>
+              <w:t>creado_en</w:t>
+            </w:r>
+          </w:p>
+        </w:tc>
+        <w:tc>
+          <w:tcPr>
+            <w:tcW w:w="1900" w:type="dxa"/>
+            <w:tcBorders>
+              <w:top w:val="single" w:sz="1" w:space="0" w:color="888888"/>
+              <w:left w:val="single" w:sz="1" w:space="0" w:color="888888"/>
+              <w:bottom w:val="single" w:sz="1" w:space="0" w:color="888888"/>
+              <w:right w:val="single" w:sz="1" w:space="0" w:color="888888"/>
+            </w:tcBorders>
+            <w:shd w:val="clear" w:color="auto" w:fill="FFFFFF"/>
+            <w:tcMar>
+              <w:top w:w="70" w:type="dxa"/>
+              <w:left w:w="120" w:type="dxa"/>
+              <w:bottom w:w="70" w:type="dxa"/>
+              <w:right w:w="120" w:type="dxa"/>
+            </w:tcMar>
+          </w:tcPr>
+          <w:p>
+            <w:pPr>
+              <w:rPr>
+                <w:color w:val="4472C4" w:themeColor="accent1"/>
+              </w:rPr>
+            </w:pPr>
             <w:r>
               <w:rPr>
                 <w:color w:val="4472C4" w:themeColor="accent1"/>
                 <w:sz w:val="19"/>
                 <w:szCs w:val="19"/>
               </w:rPr>
-              <w:t xml:space="preserve"> / Mixto</w:t>
-            </w:r>
-          </w:p>
-        </w:tc>
-      </w:tr>
-      <w:tr>
-        <w:tc>
-          <w:tcPr>
-            <w:tcW w:w="2300" w:type="dxa"/>
+              <w:t>TIMESTAMPTZ</w:t>
+            </w:r>
+          </w:p>
+        </w:tc>
+        <w:tc>
+          <w:tcPr>
+            <w:tcW w:w="1700" w:type="dxa"/>
             <w:tcBorders>
               <w:top w:val="single" w:sz="1" w:space="0" w:color="888888"/>
               <w:left w:val="single" w:sz="1" w:space="0" w:color="888888"/>
@@ -10052,13 +9432,13 @@
                 <w:sz w:val="19"/>
                 <w:szCs w:val="19"/>
               </w:rPr>
-              <w:t>profesor_id</w:t>
-            </w:r>
-          </w:p>
-        </w:tc>
-        <w:tc>
-          <w:tcPr>
-            <w:tcW w:w="1900" w:type="dxa"/>
+              <w:t>DEFAULT now()</w:t>
+            </w:r>
+          </w:p>
+        </w:tc>
+        <w:tc>
+          <w:tcPr>
+            <w:tcW w:w="3126" w:type="dxa"/>
             <w:tcBorders>
               <w:top w:val="single" w:sz="1" w:space="0" w:color="888888"/>
               <w:left w:val="single" w:sz="1" w:space="0" w:color="888888"/>
@@ -10085,349 +9465,7 @@
                 <w:sz w:val="19"/>
                 <w:szCs w:val="19"/>
               </w:rPr>
-              <w:t>INTEGER</w:t>
-            </w:r>
-          </w:p>
-        </w:tc>
-        <w:tc>
-          <w:tcPr>
-            <w:tcW w:w="1700" w:type="dxa"/>
-            <w:tcBorders>
-              <w:top w:val="single" w:sz="1" w:space="0" w:color="888888"/>
-              <w:left w:val="single" w:sz="1" w:space="0" w:color="888888"/>
-              <w:bottom w:val="single" w:sz="1" w:space="0" w:color="888888"/>
-              <w:right w:val="single" w:sz="1" w:space="0" w:color="888888"/>
-            </w:tcBorders>
-            <w:shd w:val="clear" w:color="auto" w:fill="FFFFFF"/>
-            <w:tcMar>
-              <w:top w:w="70" w:type="dxa"/>
-              <w:left w:w="120" w:type="dxa"/>
-              <w:bottom w:w="70" w:type="dxa"/>
-              <w:right w:w="120" w:type="dxa"/>
-            </w:tcMar>
-          </w:tcPr>
-          <w:p>
-            <w:pPr>
-              <w:rPr>
-                <w:color w:val="4472C4" w:themeColor="accent1"/>
-              </w:rPr>
-            </w:pPr>
-            <w:r>
-              <w:rPr>
-                <w:color w:val="4472C4" w:themeColor="accent1"/>
-                <w:sz w:val="19"/>
-                <w:szCs w:val="19"/>
-              </w:rPr>
-              <w:t>FK → usuarios(id)</w:t>
-            </w:r>
-          </w:p>
-        </w:tc>
-        <w:tc>
-          <w:tcPr>
-            <w:tcW w:w="3126" w:type="dxa"/>
-            <w:tcBorders>
-              <w:top w:val="single" w:sz="1" w:space="0" w:color="888888"/>
-              <w:left w:val="single" w:sz="1" w:space="0" w:color="888888"/>
-              <w:bottom w:val="single" w:sz="1" w:space="0" w:color="888888"/>
-              <w:right w:val="single" w:sz="1" w:space="0" w:color="888888"/>
-            </w:tcBorders>
-            <w:shd w:val="clear" w:color="auto" w:fill="FFFFFF"/>
-            <w:tcMar>
-              <w:top w:w="70" w:type="dxa"/>
-              <w:left w:w="120" w:type="dxa"/>
-              <w:bottom w:w="70" w:type="dxa"/>
-              <w:right w:w="120" w:type="dxa"/>
-            </w:tcMar>
-          </w:tcPr>
-          <w:p>
-            <w:pPr>
-              <w:rPr>
-                <w:color w:val="4472C4" w:themeColor="accent1"/>
-              </w:rPr>
-            </w:pPr>
-            <w:r>
-              <w:rPr>
-                <w:color w:val="4472C4" w:themeColor="accent1"/>
-                <w:sz w:val="19"/>
-                <w:szCs w:val="19"/>
-              </w:rPr>
-              <w:t>Profesor responsable del curso</w:t>
-            </w:r>
-          </w:p>
-        </w:tc>
-      </w:tr>
-      <w:tr>
-        <w:tc>
-          <w:tcPr>
-            <w:tcW w:w="2300" w:type="dxa"/>
-            <w:tcBorders>
-              <w:top w:val="single" w:sz="1" w:space="0" w:color="888888"/>
-              <w:left w:val="single" w:sz="1" w:space="0" w:color="888888"/>
-              <w:bottom w:val="single" w:sz="1" w:space="0" w:color="888888"/>
-              <w:right w:val="single" w:sz="1" w:space="0" w:color="888888"/>
-            </w:tcBorders>
-            <w:shd w:val="clear" w:color="auto" w:fill="F8F8F8"/>
-            <w:tcMar>
-              <w:top w:w="70" w:type="dxa"/>
-              <w:left w:w="120" w:type="dxa"/>
-              <w:bottom w:w="70" w:type="dxa"/>
-              <w:right w:w="120" w:type="dxa"/>
-            </w:tcMar>
-          </w:tcPr>
-          <w:p>
-            <w:pPr>
-              <w:rPr>
-                <w:color w:val="4472C4" w:themeColor="accent1"/>
-              </w:rPr>
-            </w:pPr>
-            <w:r>
-              <w:rPr>
-                <w:color w:val="4472C4" w:themeColor="accent1"/>
-                <w:sz w:val="19"/>
-                <w:szCs w:val="19"/>
-              </w:rPr>
-              <w:t>publicado</w:t>
-            </w:r>
-          </w:p>
-        </w:tc>
-        <w:tc>
-          <w:tcPr>
-            <w:tcW w:w="1900" w:type="dxa"/>
-            <w:tcBorders>
-              <w:top w:val="single" w:sz="1" w:space="0" w:color="888888"/>
-              <w:left w:val="single" w:sz="1" w:space="0" w:color="888888"/>
-              <w:bottom w:val="single" w:sz="1" w:space="0" w:color="888888"/>
-              <w:right w:val="single" w:sz="1" w:space="0" w:color="888888"/>
-            </w:tcBorders>
-            <w:shd w:val="clear" w:color="auto" w:fill="F8F8F8"/>
-            <w:tcMar>
-              <w:top w:w="70" w:type="dxa"/>
-              <w:left w:w="120" w:type="dxa"/>
-              <w:bottom w:w="70" w:type="dxa"/>
-              <w:right w:w="120" w:type="dxa"/>
-            </w:tcMar>
-          </w:tcPr>
-          <w:p>
-            <w:pPr>
-              <w:rPr>
-                <w:color w:val="4472C4" w:themeColor="accent1"/>
-              </w:rPr>
-            </w:pPr>
-            <w:r>
-              <w:rPr>
-                <w:color w:val="4472C4" w:themeColor="accent1"/>
-                <w:sz w:val="19"/>
-                <w:szCs w:val="19"/>
-              </w:rPr>
-              <w:t>BOOLEAN</w:t>
-            </w:r>
-          </w:p>
-        </w:tc>
-        <w:tc>
-          <w:tcPr>
-            <w:tcW w:w="1700" w:type="dxa"/>
-            <w:tcBorders>
-              <w:top w:val="single" w:sz="1" w:space="0" w:color="888888"/>
-              <w:left w:val="single" w:sz="1" w:space="0" w:color="888888"/>
-              <w:bottom w:val="single" w:sz="1" w:space="0" w:color="888888"/>
-              <w:right w:val="single" w:sz="1" w:space="0" w:color="888888"/>
-            </w:tcBorders>
-            <w:shd w:val="clear" w:color="auto" w:fill="F8F8F8"/>
-            <w:tcMar>
-              <w:top w:w="70" w:type="dxa"/>
-              <w:left w:w="120" w:type="dxa"/>
-              <w:bottom w:w="70" w:type="dxa"/>
-              <w:right w:w="120" w:type="dxa"/>
-            </w:tcMar>
-          </w:tcPr>
-          <w:p>
-            <w:pPr>
-              <w:rPr>
-                <w:color w:val="4472C4" w:themeColor="accent1"/>
-              </w:rPr>
-            </w:pPr>
-            <w:r>
-              <w:rPr>
-                <w:color w:val="4472C4" w:themeColor="accent1"/>
-                <w:sz w:val="19"/>
-                <w:szCs w:val="19"/>
-              </w:rPr>
-              <w:t>DEFAULT false</w:t>
-            </w:r>
-          </w:p>
-        </w:tc>
-        <w:tc>
-          <w:tcPr>
-            <w:tcW w:w="3126" w:type="dxa"/>
-            <w:tcBorders>
-              <w:top w:val="single" w:sz="1" w:space="0" w:color="888888"/>
-              <w:left w:val="single" w:sz="1" w:space="0" w:color="888888"/>
-              <w:bottom w:val="single" w:sz="1" w:space="0" w:color="888888"/>
-              <w:right w:val="single" w:sz="1" w:space="0" w:color="888888"/>
-            </w:tcBorders>
-            <w:shd w:val="clear" w:color="auto" w:fill="F8F8F8"/>
-            <w:tcMar>
-              <w:top w:w="70" w:type="dxa"/>
-              <w:left w:w="120" w:type="dxa"/>
-              <w:bottom w:w="70" w:type="dxa"/>
-              <w:right w:w="120" w:type="dxa"/>
-            </w:tcMar>
-          </w:tcPr>
-          <w:p>
-            <w:pPr>
-              <w:rPr>
-                <w:color w:val="4472C4" w:themeColor="accent1"/>
-              </w:rPr>
-            </w:pPr>
-            <w:r>
-              <w:rPr>
-                <w:color w:val="4472C4" w:themeColor="accent1"/>
-                <w:sz w:val="19"/>
-                <w:szCs w:val="19"/>
-              </w:rPr>
-              <w:t>Si es visible para los alumnos</w:t>
-            </w:r>
-          </w:p>
-        </w:tc>
-      </w:tr>
-      <w:tr>
-        <w:tc>
-          <w:tcPr>
-            <w:tcW w:w="2300" w:type="dxa"/>
-            <w:tcBorders>
-              <w:top w:val="single" w:sz="1" w:space="0" w:color="888888"/>
-              <w:left w:val="single" w:sz="1" w:space="0" w:color="888888"/>
-              <w:bottom w:val="single" w:sz="1" w:space="0" w:color="888888"/>
-              <w:right w:val="single" w:sz="1" w:space="0" w:color="888888"/>
-            </w:tcBorders>
-            <w:shd w:val="clear" w:color="auto" w:fill="FFFFFF"/>
-            <w:tcMar>
-              <w:top w:w="70" w:type="dxa"/>
-              <w:left w:w="120" w:type="dxa"/>
-              <w:bottom w:w="70" w:type="dxa"/>
-              <w:right w:w="120" w:type="dxa"/>
-            </w:tcMar>
-          </w:tcPr>
-          <w:p>
-            <w:pPr>
-              <w:rPr>
-                <w:color w:val="4472C4" w:themeColor="accent1"/>
-              </w:rPr>
-            </w:pPr>
-            <w:r>
-              <w:rPr>
-                <w:color w:val="4472C4" w:themeColor="accent1"/>
-                <w:sz w:val="19"/>
-                <w:szCs w:val="19"/>
-              </w:rPr>
-              <w:t>creado_en</w:t>
-            </w:r>
-          </w:p>
-        </w:tc>
-        <w:tc>
-          <w:tcPr>
-            <w:tcW w:w="1900" w:type="dxa"/>
-            <w:tcBorders>
-              <w:top w:val="single" w:sz="1" w:space="0" w:color="888888"/>
-              <w:left w:val="single" w:sz="1" w:space="0" w:color="888888"/>
-              <w:bottom w:val="single" w:sz="1" w:space="0" w:color="888888"/>
-              <w:right w:val="single" w:sz="1" w:space="0" w:color="888888"/>
-            </w:tcBorders>
-            <w:shd w:val="clear" w:color="auto" w:fill="FFFFFF"/>
-            <w:tcMar>
-              <w:top w:w="70" w:type="dxa"/>
-              <w:left w:w="120" w:type="dxa"/>
-              <w:bottom w:w="70" w:type="dxa"/>
-              <w:right w:w="120" w:type="dxa"/>
-            </w:tcMar>
-          </w:tcPr>
-          <w:p>
-            <w:pPr>
-              <w:rPr>
-                <w:color w:val="4472C4" w:themeColor="accent1"/>
-              </w:rPr>
-            </w:pPr>
-            <w:r>
-              <w:rPr>
-                <w:color w:val="4472C4" w:themeColor="accent1"/>
-                <w:sz w:val="19"/>
-                <w:szCs w:val="19"/>
-              </w:rPr>
-              <w:t>TIMESTAMPTZ</w:t>
-            </w:r>
-          </w:p>
-        </w:tc>
-        <w:tc>
-          <w:tcPr>
-            <w:tcW w:w="1700" w:type="dxa"/>
-            <w:tcBorders>
-              <w:top w:val="single" w:sz="1" w:space="0" w:color="888888"/>
-              <w:left w:val="single" w:sz="1" w:space="0" w:color="888888"/>
-              <w:bottom w:val="single" w:sz="1" w:space="0" w:color="888888"/>
-              <w:right w:val="single" w:sz="1" w:space="0" w:color="888888"/>
-            </w:tcBorders>
-            <w:shd w:val="clear" w:color="auto" w:fill="FFFFFF"/>
-            <w:tcMar>
-              <w:top w:w="70" w:type="dxa"/>
-              <w:left w:w="120" w:type="dxa"/>
-              <w:bottom w:w="70" w:type="dxa"/>
-              <w:right w:w="120" w:type="dxa"/>
-            </w:tcMar>
-          </w:tcPr>
-          <w:p>
-            <w:pPr>
-              <w:rPr>
-                <w:color w:val="4472C4" w:themeColor="accent1"/>
-              </w:rPr>
-            </w:pPr>
-            <w:r>
-              <w:rPr>
-                <w:color w:val="4472C4" w:themeColor="accent1"/>
-                <w:sz w:val="19"/>
-                <w:szCs w:val="19"/>
-              </w:rPr>
-              <w:t>DEFAULT now()</w:t>
-            </w:r>
-          </w:p>
-        </w:tc>
-        <w:tc>
-          <w:tcPr>
-            <w:tcW w:w="3126" w:type="dxa"/>
-            <w:tcBorders>
-              <w:top w:val="single" w:sz="1" w:space="0" w:color="888888"/>
-              <w:left w:val="single" w:sz="1" w:space="0" w:color="888888"/>
-              <w:bottom w:val="single" w:sz="1" w:space="0" w:color="888888"/>
-              <w:right w:val="single" w:sz="1" w:space="0" w:color="888888"/>
-            </w:tcBorders>
-            <w:shd w:val="clear" w:color="auto" w:fill="FFFFFF"/>
-            <w:tcMar>
-              <w:top w:w="70" w:type="dxa"/>
-              <w:left w:w="120" w:type="dxa"/>
-              <w:bottom w:w="70" w:type="dxa"/>
-              <w:right w:w="120" w:type="dxa"/>
-            </w:tcMar>
-          </w:tcPr>
-          <w:p>
-            <w:pPr>
-              <w:rPr>
-                <w:color w:val="4472C4" w:themeColor="accent1"/>
-              </w:rPr>
-            </w:pPr>
-            <w:r>
-              <w:rPr>
-                <w:color w:val="4472C4" w:themeColor="accent1"/>
-                <w:sz w:val="19"/>
-                <w:szCs w:val="19"/>
-              </w:rPr>
-              <w:t xml:space="preserve">Fecha de </w:t>
-            </w:r>
-            <w:r>
-              <w:rPr>
-                <w:color w:val="4472C4" w:themeColor="accent1"/>
-                <w:sz w:val="19"/>
-                <w:szCs w:val="19"/>
-              </w:rPr>
-              <w:t>creación</w:t>
+              <w:t>Fecha de creación</w:t>
             </w:r>
           </w:p>
         </w:tc>
@@ -10741,31 +9779,7 @@
                 <w:sz w:val="19"/>
                 <w:szCs w:val="19"/>
               </w:rPr>
-              <w:t xml:space="preserve">Identificador </w:t>
-            </w:r>
-            <w:r>
-              <w:rPr>
-                <w:color w:val="4472C4" w:themeColor="accent1"/>
-                <w:sz w:val="19"/>
-                <w:szCs w:val="19"/>
-              </w:rPr>
-              <w:t>único</w:t>
-            </w:r>
-            <w:r>
-              <w:rPr>
-                <w:color w:val="4472C4" w:themeColor="accent1"/>
-                <w:sz w:val="19"/>
-                <w:szCs w:val="19"/>
-              </w:rPr>
-              <w:t xml:space="preserve"> de la </w:t>
-            </w:r>
-            <w:r>
-              <w:rPr>
-                <w:color w:val="4472C4" w:themeColor="accent1"/>
-                <w:sz w:val="19"/>
-                <w:szCs w:val="19"/>
-              </w:rPr>
-              <w:t>lección</w:t>
+              <w:t>Identificador único de la lección</w:t>
             </w:r>
           </w:p>
         </w:tc>
@@ -11733,15 +10747,7 @@
                 <w:sz w:val="19"/>
                 <w:szCs w:val="19"/>
               </w:rPr>
-              <w:t xml:space="preserve">Identificador </w:t>
-            </w:r>
-            <w:r>
-              <w:rPr>
-                <w:color w:val="4472C4" w:themeColor="accent1"/>
-                <w:sz w:val="19"/>
-                <w:szCs w:val="19"/>
-              </w:rPr>
-              <w:t>único</w:t>
+              <w:t>Identificador único</w:t>
             </w:r>
           </w:p>
         </w:tc>
@@ -13127,23 +12133,7 @@
                 <w:sz w:val="19"/>
                 <w:szCs w:val="19"/>
               </w:rPr>
-              <w:t xml:space="preserve">Identificador </w:t>
-            </w:r>
-            <w:r>
-              <w:rPr>
-                <w:color w:val="4472C4" w:themeColor="accent1"/>
-                <w:sz w:val="19"/>
-                <w:szCs w:val="19"/>
-              </w:rPr>
-              <w:t>único</w:t>
-            </w:r>
-            <w:r>
-              <w:rPr>
-                <w:color w:val="4472C4" w:themeColor="accent1"/>
-                <w:sz w:val="19"/>
-                <w:szCs w:val="19"/>
-              </w:rPr>
-              <w:t xml:space="preserve"> de la partida</w:t>
+              <w:t>Identificador único de la partida</w:t>
             </w:r>
           </w:p>
         </w:tc>
@@ -14395,15 +13385,7 @@
                 <w:sz w:val="19"/>
                 <w:szCs w:val="19"/>
               </w:rPr>
-              <w:t xml:space="preserve">Identificador </w:t>
-            </w:r>
-            <w:r>
-              <w:rPr>
-                <w:color w:val="4472C4" w:themeColor="accent1"/>
-                <w:sz w:val="19"/>
-                <w:szCs w:val="19"/>
-              </w:rPr>
-              <w:t>único</w:t>
+              <w:t>Identificador único</w:t>
             </w:r>
           </w:p>
         </w:tc>
@@ -14977,67 +13959,31 @@
         <w:rPr>
           <w:color w:val="222222"/>
         </w:rPr>
-        <w:t xml:space="preserve">El proyecto sigue una arquitectura MVC. Cada clase del modelo se corresponde con una tabla de la base de datos. Los controladores orquestan la </w:t>
-      </w:r>
+        <w:t>El proyecto sigue una arquitectura MVC. Cada clase del modelo se corresponde con una tabla de la base de datos. Los controladores orquestan la lógica entre modelos y vistas.</w:t>
+      </w:r>
+    </w:p>
+    <w:p>
+      <w:pPr>
+        <w:spacing w:before="40" w:after="40"/>
+      </w:pPr>
+    </w:p>
+    <w:p>
+      <w:pPr>
+        <w:pStyle w:val="Ttulo2"/>
+      </w:pPr>
+      <w:r>
+        <w:t>7.1. Diagrama de clases</w:t>
+      </w:r>
+    </w:p>
+    <w:p>
+      <w:pPr>
+        <w:spacing w:before="60" w:after="60"/>
+      </w:pPr>
       <w:r>
         <w:rPr>
           <w:color w:val="222222"/>
         </w:rPr>
-        <w:t>lógica</w:t>
-      </w:r>
-      <w:r>
-        <w:rPr>
-          <w:color w:val="222222"/>
-        </w:rPr>
-        <w:t xml:space="preserve"> entre modelos y vistas.</w:t>
-      </w:r>
-    </w:p>
-    <w:p>
-      <w:pPr>
-        <w:spacing w:before="40" w:after="40"/>
-      </w:pPr>
-    </w:p>
-    <w:p>
-      <w:pPr>
-        <w:pStyle w:val="Ttulo2"/>
-      </w:pPr>
-      <w:r>
-        <w:t>7.1. Diagrama de clases</w:t>
-      </w:r>
-    </w:p>
-    <w:p>
-      <w:pPr>
-        <w:spacing w:before="60" w:after="60"/>
-      </w:pPr>
-      <w:r>
-        <w:rPr>
-          <w:color w:val="222222"/>
-        </w:rPr>
-        <w:t xml:space="preserve">Las siguientes tablas representan las clases del modelo en </w:t>
-      </w:r>
-      <w:r>
-        <w:rPr>
-          <w:color w:val="222222"/>
-        </w:rPr>
-        <w:t>notación</w:t>
-      </w:r>
-      <w:r>
-        <w:rPr>
-          <w:color w:val="222222"/>
-        </w:rPr>
-        <w:t xml:space="preserve"> UML. Cada clase se divide en tres secciones: nombre, atributos (-) y </w:t>
-      </w:r>
-      <w:r>
-        <w:rPr>
-          <w:color w:val="222222"/>
-        </w:rPr>
-        <w:t>métodos</w:t>
-      </w:r>
-      <w:r>
-        <w:rPr>
-          <w:color w:val="222222"/>
-        </w:rPr>
-        <w:t xml:space="preserve"> (+).</w:t>
+        <w:t>Las siguientes tablas representan las clases del modelo en notación UML. Cada clase se divide en tres secciones: nombre, atributos (-) y métodos (+).</w:t>
       </w:r>
     </w:p>
     <w:p>
@@ -15299,8 +14245,39 @@
                       <w:sz w:val="18"/>
                       <w:szCs w:val="18"/>
                     </w:rPr>
-                    <w:t>+ registrar() : bool</w:t>
+                    <w:t xml:space="preserve">+ </w:t>
                   </w:r>
+                  <w:proofErr w:type="gramStart"/>
+                  <w:r>
+                    <w:rPr>
+                      <w:rFonts w:ascii="Courier New" w:eastAsia="Courier New" w:hAnsi="Courier New" w:cs="Courier New"/>
+                      <w:color w:val="4472C4" w:themeColor="accent1"/>
+                      <w:sz w:val="18"/>
+                      <w:szCs w:val="18"/>
+                    </w:rPr>
+                    <w:t>registrar() :</w:t>
+                  </w:r>
+                  <w:proofErr w:type="gramEnd"/>
+                  <w:r>
+                    <w:rPr>
+                      <w:rFonts w:ascii="Courier New" w:eastAsia="Courier New" w:hAnsi="Courier New" w:cs="Courier New"/>
+                      <w:color w:val="4472C4" w:themeColor="accent1"/>
+                      <w:sz w:val="18"/>
+                      <w:szCs w:val="18"/>
+                    </w:rPr>
+                    <w:t xml:space="preserve"> </w:t>
+                  </w:r>
+                  <w:proofErr w:type="spellStart"/>
+                  <w:r>
+                    <w:rPr>
+                      <w:rFonts w:ascii="Courier New" w:eastAsia="Courier New" w:hAnsi="Courier New" w:cs="Courier New"/>
+                      <w:color w:val="4472C4" w:themeColor="accent1"/>
+                      <w:sz w:val="18"/>
+                      <w:szCs w:val="18"/>
+                    </w:rPr>
+                    <w:t>bool</w:t>
+                  </w:r>
+                  <w:proofErr w:type="spellEnd"/>
                 </w:p>
                 <w:p>
                   <w:pPr>
@@ -15863,8 +14840,39 @@
                       <w:sz w:val="18"/>
                       <w:szCs w:val="18"/>
                     </w:rPr>
-                    <w:t>+ crear() : bool</w:t>
+                    <w:t xml:space="preserve">+ </w:t>
                   </w:r>
+                  <w:proofErr w:type="gramStart"/>
+                  <w:r>
+                    <w:rPr>
+                      <w:rFonts w:ascii="Courier New" w:eastAsia="Courier New" w:hAnsi="Courier New" w:cs="Courier New"/>
+                      <w:color w:val="4472C4" w:themeColor="accent1"/>
+                      <w:sz w:val="18"/>
+                      <w:szCs w:val="18"/>
+                    </w:rPr>
+                    <w:t>crear() :</w:t>
+                  </w:r>
+                  <w:proofErr w:type="gramEnd"/>
+                  <w:r>
+                    <w:rPr>
+                      <w:rFonts w:ascii="Courier New" w:eastAsia="Courier New" w:hAnsi="Courier New" w:cs="Courier New"/>
+                      <w:color w:val="4472C4" w:themeColor="accent1"/>
+                      <w:sz w:val="18"/>
+                      <w:szCs w:val="18"/>
+                    </w:rPr>
+                    <w:t xml:space="preserve"> </w:t>
+                  </w:r>
+                  <w:proofErr w:type="spellStart"/>
+                  <w:r>
+                    <w:rPr>
+                      <w:rFonts w:ascii="Courier New" w:eastAsia="Courier New" w:hAnsi="Courier New" w:cs="Courier New"/>
+                      <w:color w:val="4472C4" w:themeColor="accent1"/>
+                      <w:sz w:val="18"/>
+                      <w:szCs w:val="18"/>
+                    </w:rPr>
+                    <w:t>bool</w:t>
+                  </w:r>
+                  <w:proofErr w:type="spellEnd"/>
                 </w:p>
                 <w:p>
                   <w:pPr>
@@ -16821,13 +15829,7 @@
         <w:pStyle w:val="Ttulo2"/>
       </w:pPr>
       <w:r>
-        <w:t>7.</w:t>
-      </w:r>
-      <w:r>
-        <w:t>2</w:t>
-      </w:r>
-      <w:r>
-        <w:t>. Controladores</w:t>
+        <w:t>7.2. Controladores</w:t>
       </w:r>
     </w:p>
     <w:p>
@@ -17082,6 +16084,7 @@
                 <w:color w:val="4472C4" w:themeColor="accent1"/>
               </w:rPr>
             </w:pPr>
+            <w:proofErr w:type="spellStart"/>
             <w:r>
               <w:rPr>
                 <w:b/>
@@ -17090,6 +16093,7 @@
               </w:rPr>
               <w:t>AdminController</w:t>
             </w:r>
+            <w:proofErr w:type="spellEnd"/>
           </w:p>
         </w:tc>
         <w:tc>
@@ -17273,13 +16277,7 @@
         <w:pStyle w:val="Ttulo2"/>
       </w:pPr>
       <w:r>
-        <w:t>7.</w:t>
-      </w:r>
-      <w:r>
-        <w:t>3</w:t>
-      </w:r>
-      <w:r>
-        <w:t>. Relaciones entre clases</w:t>
+        <w:t>7.3. Relaciones entre clases</w:t>
       </w:r>
     </w:p>
     <w:p>
@@ -17500,19 +16498,7 @@
               <w:rPr>
                 <w:color w:val="4472C4" w:themeColor="accent1"/>
               </w:rPr>
-              <w:t xml:space="preserve">Un usuario puede tener </w:t>
-            </w:r>
-            <w:r>
-              <w:rPr>
-                <w:color w:val="4472C4" w:themeColor="accent1"/>
-              </w:rPr>
-              <w:t>múltiples</w:t>
-            </w:r>
-            <w:r>
-              <w:rPr>
-                <w:color w:val="4472C4" w:themeColor="accent1"/>
-              </w:rPr>
-              <w:t xml:space="preserve"> partidas registradas</w:t>
+              <w:t>Un usuario puede tener múltiples partidas registradas</w:t>
             </w:r>
           </w:p>
         </w:tc>
@@ -17545,13 +16531,7 @@
               <w:rPr>
                 <w:color w:val="4472C4" w:themeColor="accent1"/>
               </w:rPr>
-              <w:t xml:space="preserve">Curso → </w:t>
-            </w:r>
-            <w:r>
-              <w:rPr>
-                <w:color w:val="4472C4" w:themeColor="accent1"/>
-              </w:rPr>
-              <w:t>Lección</w:t>
+              <w:t>Curso → Lección</w:t>
             </w:r>
           </w:p>
         </w:tc>
@@ -17898,19 +16878,7 @@
               <w:rPr>
                 <w:color w:val="4472C4" w:themeColor="accent1"/>
               </w:rPr>
-              <w:t xml:space="preserve">Cada partida corresponde a un </w:t>
-            </w:r>
-            <w:r>
-              <w:rPr>
-                <w:color w:val="4472C4" w:themeColor="accent1"/>
-              </w:rPr>
-              <w:t>único</w:t>
-            </w:r>
-            <w:r>
-              <w:rPr>
-                <w:color w:val="4472C4" w:themeColor="accent1"/>
-              </w:rPr>
-              <w:t xml:space="preserve"> curso</w:t>
+              <w:t>Cada partida corresponde a un único curso</w:t>
             </w:r>
           </w:p>
         </w:tc>
@@ -18773,23 +17741,7 @@
                 <w:bCs/>
                 <w:color w:val="4472C4" w:themeColor="accent1"/>
               </w:rPr>
-              <w:t>Dise</w:t>
-            </w:r>
-            <w:r>
-              <w:rPr>
-                <w:b/>
-                <w:bCs/>
-                <w:color w:val="4472C4" w:themeColor="accent1"/>
-              </w:rPr>
-              <w:t>ñ</w:t>
-            </w:r>
-            <w:r>
-              <w:rPr>
-                <w:b/>
-                <w:bCs/>
-                <w:color w:val="4472C4" w:themeColor="accent1"/>
-              </w:rPr>
-              <w:t>o</w:t>
+              <w:t>Diseño</w:t>
             </w:r>
           </w:p>
         </w:tc>
@@ -18892,7 +17844,7 @@
           <w:noProof/>
         </w:rPr>
         <w:drawing>
-          <wp:anchor distT="0" distB="0" distL="114300" distR="114300" simplePos="0" relativeHeight="251662336" behindDoc="1" locked="0" layoutInCell="1" allowOverlap="1" wp14:anchorId="5740388A" wp14:editId="7F4CB28B">
+          <wp:anchor distT="0" distB="0" distL="114300" distR="114300" simplePos="0" relativeHeight="251662336" behindDoc="1" locked="0" layoutInCell="1" allowOverlap="1" wp14:anchorId="7338CF78" wp14:editId="657C1E29">
             <wp:simplePos x="0" y="0"/>
             <wp:positionH relativeFrom="column">
               <wp:posOffset>0</wp:posOffset>
@@ -19127,8 +18079,13 @@
                 <w:sz w:val="18"/>
                 <w:szCs w:val="18"/>
               </w:rPr>
-              <w:t xml:space="preserve">feature/game----+      </w:t>
-            </w:r>
+              <w:t>feature/game----+          |</w:t>
+            </w:r>
+          </w:p>
+          <w:p>
+            <w:pPr>
+              <w:spacing w:before="20" w:after="20"/>
+            </w:pPr>
             <w:r>
               <w:rPr>
                 <w:rFonts w:ascii="Courier New" w:eastAsia="Courier New" w:hAnsi="Courier New" w:cs="Courier New"/>
@@ -19136,48 +18093,7 @@
                 <w:sz w:val="18"/>
                 <w:szCs w:val="18"/>
               </w:rPr>
-              <w:t xml:space="preserve">    </w:t>
-            </w:r>
-            <w:r>
-              <w:rPr>
-                <w:rFonts w:ascii="Courier New" w:eastAsia="Courier New" w:hAnsi="Courier New" w:cs="Courier New"/>
-                <w:color w:val="222222"/>
-                <w:sz w:val="18"/>
-                <w:szCs w:val="18"/>
-              </w:rPr>
-              <w:t>|</w:t>
-            </w:r>
-          </w:p>
-          <w:p>
-            <w:pPr>
-              <w:spacing w:before="20" w:after="20"/>
-            </w:pPr>
-            <w:r>
-              <w:rPr>
-                <w:rFonts w:ascii="Courier New" w:eastAsia="Courier New" w:hAnsi="Courier New" w:cs="Courier New"/>
-                <w:color w:val="222222"/>
-                <w:sz w:val="18"/>
-                <w:szCs w:val="18"/>
-              </w:rPr>
-              <w:t xml:space="preserve">                    </w:t>
-            </w:r>
-            <w:r>
-              <w:rPr>
-                <w:rFonts w:ascii="Courier New" w:eastAsia="Courier New" w:hAnsi="Courier New" w:cs="Courier New"/>
-                <w:color w:val="222222"/>
-                <w:sz w:val="18"/>
-                <w:szCs w:val="18"/>
-              </w:rPr>
-              <w:t xml:space="preserve">  </w:t>
-            </w:r>
-            <w:r>
-              <w:rPr>
-                <w:rFonts w:ascii="Courier New" w:eastAsia="Courier New" w:hAnsi="Courier New" w:cs="Courier New"/>
-                <w:color w:val="222222"/>
-                <w:sz w:val="18"/>
-                <w:szCs w:val="18"/>
-              </w:rPr>
-              <w:t xml:space="preserve"> feature/admin-----+</w:t>
+              <w:t xml:space="preserve">                       feature/admin-----+</w:t>
             </w:r>
           </w:p>
           <w:p>
@@ -19322,19 +18238,7 @@
         <w:rPr>
           <w:color w:val="222222"/>
         </w:rPr>
-        <w:t xml:space="preserve">La API devuelve JSON y es consumida por el JavaScript del frontend mediante fetch(). Todos los endpoints verifican </w:t>
-      </w:r>
-      <w:r>
-        <w:rPr>
-          <w:color w:val="222222"/>
-        </w:rPr>
-        <w:t>sesión</w:t>
-      </w:r>
-      <w:r>
-        <w:rPr>
-          <w:color w:val="222222"/>
-        </w:rPr>
-        <w:t xml:space="preserve"> activa antes de responder.</w:t>
+        <w:t>La API devuelve JSON y es consumida por el JavaScript del frontend mediante fetch(). Todos los endpoints verifican sesión activa antes de responder.</w:t>
       </w:r>
     </w:p>
     <w:p>
@@ -20716,6 +19620,9 @@
           <w:p>
             <w:pPr>
               <w:spacing w:before="20" w:after="20"/>
+              <w:rPr>
+                <w:lang w:val="en-US"/>
+              </w:rPr>
             </w:pPr>
             <w:r>
               <w:rPr>
@@ -20723,65 +19630,918 @@
                 <w:color w:val="222222"/>
                 <w:sz w:val="18"/>
                 <w:szCs w:val="18"/>
-              </w:rPr>
-              <w:t>|       `-- js/game.js      &lt;- logica del trivial con fetch()</w:t>
-            </w:r>
-          </w:p>
-          <w:p>
-            <w:pPr>
-              <w:spacing w:before="20" w:after="20"/>
-            </w:pPr>
+                <w:lang w:val="en-US"/>
+              </w:rPr>
+              <w:t xml:space="preserve">|       `-- </w:t>
+            </w:r>
+            <w:proofErr w:type="spellStart"/>
             <w:r>
               <w:rPr>
                 <w:rFonts w:ascii="Courier New" w:eastAsia="Courier New" w:hAnsi="Courier New" w:cs="Courier New"/>
                 <w:color w:val="222222"/>
                 <w:sz w:val="18"/>
                 <w:szCs w:val="18"/>
-              </w:rPr>
-              <w:t>|</w:t>
-            </w:r>
-          </w:p>
-          <w:p>
-            <w:pPr>
-              <w:spacing w:before="20" w:after="20"/>
-            </w:pPr>
+                <w:lang w:val="en-US"/>
+              </w:rPr>
+              <w:t>js</w:t>
+            </w:r>
+            <w:proofErr w:type="spellEnd"/>
             <w:r>
               <w:rPr>
                 <w:rFonts w:ascii="Courier New" w:eastAsia="Courier New" w:hAnsi="Courier New" w:cs="Courier New"/>
                 <w:color w:val="222222"/>
                 <w:sz w:val="18"/>
                 <w:szCs w:val="18"/>
-              </w:rPr>
-              <w:t>`-- database/</w:t>
-            </w:r>
-          </w:p>
-          <w:p>
-            <w:pPr>
-              <w:spacing w:before="20" w:after="20"/>
-            </w:pPr>
+                <w:lang w:val="en-US"/>
+              </w:rPr>
+              <w:t xml:space="preserve">/game.js      &lt;- </w:t>
+            </w:r>
+            <w:proofErr w:type="spellStart"/>
             <w:r>
               <w:rPr>
                 <w:rFonts w:ascii="Courier New" w:eastAsia="Courier New" w:hAnsi="Courier New" w:cs="Courier New"/>
                 <w:color w:val="222222"/>
                 <w:sz w:val="18"/>
                 <w:szCs w:val="18"/>
-              </w:rPr>
-              <w:t xml:space="preserve">    </w:t>
-            </w:r>
+                <w:lang w:val="en-US"/>
+              </w:rPr>
+              <w:t>logica</w:t>
+            </w:r>
+            <w:proofErr w:type="spellEnd"/>
             <w:r>
               <w:rPr>
                 <w:rFonts w:ascii="Courier New" w:eastAsia="Courier New" w:hAnsi="Courier New" w:cs="Courier New"/>
                 <w:color w:val="222222"/>
                 <w:sz w:val="18"/>
                 <w:szCs w:val="18"/>
-              </w:rPr>
-              <w:t>`-- init.sql            &lt;- script SQL ejecutado al iniciar el contenedor</w:t>
+                <w:lang w:val="en-US"/>
+              </w:rPr>
+              <w:t xml:space="preserve"> del trivial con </w:t>
+            </w:r>
+            <w:proofErr w:type="gramStart"/>
+            <w:r>
+              <w:rPr>
+                <w:rFonts w:ascii="Courier New" w:eastAsia="Courier New" w:hAnsi="Courier New" w:cs="Courier New"/>
+                <w:color w:val="222222"/>
+                <w:sz w:val="18"/>
+                <w:szCs w:val="18"/>
+                <w:lang w:val="en-US"/>
+              </w:rPr>
+              <w:t>fetch(</w:t>
+            </w:r>
+            <w:proofErr w:type="gramEnd"/>
+            <w:r>
+              <w:rPr>
+                <w:rFonts w:ascii="Courier New" w:eastAsia="Courier New" w:hAnsi="Courier New" w:cs="Courier New"/>
+                <w:color w:val="222222"/>
+                <w:sz w:val="18"/>
+                <w:szCs w:val="18"/>
+                <w:lang w:val="en-US"/>
+              </w:rPr>
+              <w:t>)</w:t>
+            </w:r>
+          </w:p>
+          <w:p>
+            <w:pPr>
+              <w:spacing w:before="20" w:after="20"/>
+              <w:rPr>
+                <w:lang w:val="en-US"/>
+              </w:rPr>
+            </w:pPr>
+            <w:r>
+              <w:rPr>
+                <w:rFonts w:ascii="Courier New" w:eastAsia="Courier New" w:hAnsi="Courier New" w:cs="Courier New"/>
+                <w:color w:val="222222"/>
+                <w:sz w:val="18"/>
+                <w:szCs w:val="18"/>
+                <w:lang w:val="en-US"/>
+              </w:rPr>
+              <w:t>|</w:t>
+            </w:r>
+          </w:p>
+          <w:p>
+            <w:pPr>
+              <w:spacing w:before="20" w:after="20"/>
+              <w:rPr>
+                <w:lang w:val="en-US"/>
+              </w:rPr>
+            </w:pPr>
+            <w:r>
+              <w:rPr>
+                <w:rFonts w:ascii="Courier New" w:eastAsia="Courier New" w:hAnsi="Courier New" w:cs="Courier New"/>
+                <w:color w:val="222222"/>
+                <w:sz w:val="18"/>
+                <w:szCs w:val="18"/>
+                <w:lang w:val="en-US"/>
+              </w:rPr>
+              <w:t>`-- database/</w:t>
+            </w:r>
+          </w:p>
+          <w:p>
+            <w:pPr>
+              <w:spacing w:before="20" w:after="20"/>
+            </w:pPr>
+            <w:r>
+              <w:rPr>
+                <w:rFonts w:ascii="Courier New" w:eastAsia="Courier New" w:hAnsi="Courier New" w:cs="Courier New"/>
+                <w:color w:val="222222"/>
+                <w:sz w:val="18"/>
+                <w:szCs w:val="18"/>
+                <w:lang w:val="en-US"/>
+              </w:rPr>
+              <w:t xml:space="preserve">    </w:t>
+            </w:r>
+            <w:r>
+              <w:rPr>
+                <w:rFonts w:ascii="Courier New" w:eastAsia="Courier New" w:hAnsi="Courier New" w:cs="Courier New"/>
+                <w:color w:val="222222"/>
+                <w:sz w:val="18"/>
+                <w:szCs w:val="18"/>
+              </w:rPr>
+              <w:t xml:space="preserve">`-- </w:t>
+            </w:r>
+            <w:proofErr w:type="spellStart"/>
+            <w:r>
+              <w:rPr>
+                <w:rFonts w:ascii="Courier New" w:eastAsia="Courier New" w:hAnsi="Courier New" w:cs="Courier New"/>
+                <w:color w:val="222222"/>
+                <w:sz w:val="18"/>
+                <w:szCs w:val="18"/>
+              </w:rPr>
+              <w:t>init.sql</w:t>
+            </w:r>
+            <w:proofErr w:type="spellEnd"/>
+            <w:r>
+              <w:rPr>
+                <w:rFonts w:ascii="Courier New" w:eastAsia="Courier New" w:hAnsi="Courier New" w:cs="Courier New"/>
+                <w:color w:val="222222"/>
+                <w:sz w:val="18"/>
+                <w:szCs w:val="18"/>
+              </w:rPr>
+              <w:t xml:space="preserve">            &lt;- script SQL ejecutado al iniciar el contenedor</w:t>
             </w:r>
           </w:p>
         </w:tc>
       </w:tr>
     </w:tbl>
     <w:p/>
+    <w:p>
+      <w:r>
+        <w:br w:type="page"/>
+      </w:r>
+    </w:p>
+    <w:p>
+      <w:pPr>
+        <w:rPr>
+          <w:rFonts w:ascii="Arial" w:hAnsi="Arial" w:cs="Arial"/>
+          <w:sz w:val="28"/>
+          <w:szCs w:val="28"/>
+        </w:rPr>
+      </w:pPr>
+      <w:r>
+        <w:rPr>
+          <w:rFonts w:ascii="Arial" w:hAnsi="Arial" w:cs="Arial"/>
+          <w:sz w:val="28"/>
+          <w:szCs w:val="28"/>
+        </w:rPr>
+        <w:lastRenderedPageBreak/>
+        <w:t>4. Primera Versión del Proyecto</w:t>
+      </w:r>
+    </w:p>
+    <w:p>
+      <w:pPr>
+        <w:spacing w:before="120" w:after="120"/>
+      </w:pPr>
+      <w:r>
+        <w:t>Esta sección documenta el proceso de desarrollo correspondiente a la 2.ª entrega del proyecto GeoLearn, realizada en abril de 2026. Se describe la primera versión funcional de la aplicación, las decisiones técnicas adoptadas, las pruebas realizadas y las dificultades encontradas durante el desarrollo.</w:t>
+      </w:r>
+    </w:p>
+    <w:p>
+      <w:r>
+        <w:t>4.1. Alcance de la Primera Versión</w:t>
+      </w:r>
+    </w:p>
+    <w:p>
+      <w:pPr>
+        <w:spacing w:before="80" w:after="80"/>
+      </w:pPr>
+      <w:r>
+        <w:t>La primera versión funcional de GeoLearn incluye los siguientes componentes implementados y operativos:</w:t>
+      </w:r>
+    </w:p>
+    <w:p>
+      <w:pPr>
+        <w:spacing w:before="60" w:after="60"/>
+        <w:ind w:left="720"/>
+      </w:pPr>
+      <w:r>
+        <w:rPr>
+          <w:b/>
+        </w:rPr>
+        <w:t>Entorno Docker:</w:t>
+      </w:r>
+      <w:r>
+        <w:t xml:space="preserve"> Configuración completa con dos contenedores: geolearn_app (PHP 8.2 + Apache) en el puerto 8080 y geolearn_db (PostgreSQL 16) en el puerto 5432. El entorno es reproducible en cualquier máquina con Docker instalado.</w:t>
+      </w:r>
+    </w:p>
+    <w:p>
+      <w:pPr>
+        <w:spacing w:before="60" w:after="60"/>
+        <w:ind w:left="720"/>
+      </w:pPr>
+      <w:r>
+        <w:rPr>
+          <w:b/>
+        </w:rPr>
+        <w:t>Arquitectura MVC:</w:t>
+      </w:r>
+      <w:r>
+        <w:t xml:space="preserve"> Estructura de directorios completa con separación de controladores, modelos y vistas. Router principal en index.php con redireccionamiento mediante .htaccess y mod_rewrite de Apache.</w:t>
+      </w:r>
+    </w:p>
+    <w:p>
+      <w:pPr>
+        <w:spacing w:before="60" w:after="60"/>
+        <w:ind w:left="720"/>
+      </w:pPr>
+      <w:r>
+        <w:rPr>
+          <w:b/>
+        </w:rPr>
+        <w:t>Base de datos:</w:t>
+      </w:r>
+      <w:r>
+        <w:t xml:space="preserve"> Las 6 tablas del modelo de datos (usuarios, cursos, lecciones, preguntas, partidas y matrículas) inicializadas automáticamente al arrancar el contenedor mediante init.sql. Se incluyen restricciones CHECK, claves foráneas y un usuario administrador por defecto.</w:t>
+      </w:r>
+    </w:p>
+    <w:p>
+      <w:pPr>
+        <w:spacing w:before="60" w:after="60"/>
+        <w:ind w:left="720"/>
+      </w:pPr>
+      <w:r>
+        <w:rPr>
+          <w:b/>
+        </w:rPr>
+        <w:t>Sistema de autenticación:</w:t>
+      </w:r>
+      <w:r>
+        <w:t xml:space="preserve"> Login y registro completamente funcionales. Las contraseñas se almacenan con password_hash() de PHP. Las sesiones gestionan el rol del usuario (alumno, profesor, admin) y redirigen al panel correspondiente tras el login.</w:t>
+      </w:r>
+    </w:p>
+    <w:p>
+      <w:pPr>
+        <w:spacing w:before="60" w:after="60"/>
+        <w:ind w:left="720"/>
+      </w:pPr>
+      <w:r>
+        <w:rPr>
+          <w:b/>
+        </w:rPr>
+        <w:t>Dashboards por rol:</w:t>
+      </w:r>
+      <w:r>
+        <w:t xml:space="preserve"> Panel del alumno con resumen de cursos y partidas, y panel de administración con listado de usuarios registrados. Interfaz responsive con diseño CSS propio basado en variables de color.</w:t>
+      </w:r>
+    </w:p>
+    <w:p>
+      <w:pPr>
+        <w:spacing w:before="60" w:after="60"/>
+        <w:ind w:left="720"/>
+      </w:pPr>
+      <w:r>
+        <w:rPr>
+          <w:b/>
+        </w:rPr>
+        <w:t>Control de versiones:</w:t>
+      </w:r>
+      <w:r>
+        <w:t xml:space="preserve"> Repositorio Git inicializado y publicado en GitHub (https://github.com/NestorSoftware/GeoLearn) con rama main operativa.</w:t>
+      </w:r>
+    </w:p>
+    <w:p>
+      <w:r>
+        <w:t>4.2. Variaciones respecto al Anteproyecto</w:t>
+      </w:r>
+    </w:p>
+    <w:p>
+      <w:pPr>
+        <w:spacing w:before="80" w:after="80"/>
+      </w:pPr>
+      <w:r>
+        <w:t>No se han producido variaciones significativas respecto a lo planificado en el anteproyecto. Los objetivos, la planificación temporal y el modelo de datos se mantienen tal como fueron definidos en la 1.ª entrega.</w:t>
+      </w:r>
+    </w:p>
+    <w:p>
+      <w:pPr>
+        <w:spacing w:before="80" w:after="80"/>
+      </w:pPr>
+      <w:r>
+        <w:t xml:space="preserve">Como mejora técnica respecto al anteproyecto, se ha añadido la restricción </w:t>
+      </w:r>
+      <w:r>
+        <w:rPr>
+          <w:rFonts w:ascii="Courier New" w:hAnsi="Courier New"/>
+        </w:rPr>
+        <w:t>CHECK (rol IN (‘alumno’, ‘profesor’, ‘admin’))</w:t>
+      </w:r>
+      <w:r>
+        <w:t xml:space="preserve"> en la tabla usuarios para garantizar la integridad de los datos a nivel de base de datos.</w:t>
+      </w:r>
+    </w:p>
+    <w:p>
+      <w:r>
+        <w:t>4.3. Pruebas Realizadas</w:t>
+      </w:r>
+    </w:p>
+    <w:p>
+      <w:pPr>
+        <w:spacing w:before="80" w:after="80"/>
+      </w:pPr>
+      <w:r>
+        <w:t>Se han realizado las siguientes pruebas funcionales sobre la primera versión de la aplicación:</w:t>
+      </w:r>
+    </w:p>
+    <w:p>
+      <w:pPr>
+        <w:spacing w:before="60" w:after="60"/>
+        <w:ind w:left="720"/>
+      </w:pPr>
+      <w:r>
+        <w:rPr>
+          <w:b/>
+        </w:rPr>
+        <w:t>Prueba 1 — Login con credenciales correctas</w:t>
+      </w:r>
+    </w:p>
+    <w:p>
+      <w:pPr>
+        <w:spacing w:before="40" w:after="40"/>
+        <w:ind w:left="1080"/>
+      </w:pPr>
+      <w:r>
+        <w:rPr>
+          <w:i/>
+        </w:rPr>
+        <w:t>Planteamiento:</w:t>
+      </w:r>
+      <w:r>
+        <w:t xml:space="preserve"> Verificar que el sistema autentica correctamente a un usuario existente y redirige según su rol.</w:t>
+      </w:r>
+    </w:p>
+    <w:p>
+      <w:pPr>
+        <w:spacing w:before="40" w:after="40"/>
+        <w:ind w:left="1080"/>
+      </w:pPr>
+      <w:r>
+        <w:rPr>
+          <w:i/>
+        </w:rPr>
+        <w:t>Entrada:</w:t>
+      </w:r>
+      <w:r>
+        <w:t xml:space="preserve"> Email: admin@geolearn.com / Contraseña: admin1234.</w:t>
+      </w:r>
+    </w:p>
+    <w:p>
+      <w:pPr>
+        <w:spacing w:before="40" w:after="40"/>
+        <w:ind w:left="1080"/>
+      </w:pPr>
+      <w:r>
+        <w:rPr>
+          <w:i/>
+        </w:rPr>
+        <w:t>Salida prevista:</w:t>
+      </w:r>
+      <w:r>
+        <w:t xml:space="preserve"> Redirección al panel de administración.</w:t>
+      </w:r>
+    </w:p>
+    <w:p>
+      <w:pPr>
+        <w:spacing w:before="40" w:after="40"/>
+        <w:ind w:left="1080"/>
+      </w:pPr>
+      <w:r>
+        <w:rPr>
+          <w:i/>
+        </w:rPr>
+        <w:t>Salida obtenida:</w:t>
+      </w:r>
+      <w:r>
+        <w:t xml:space="preserve"> Correcta tras corregir el hash de contraseña en la base de datos (ver apartado 4.4).</w:t>
+      </w:r>
+    </w:p>
+    <w:p>
+      <w:pPr>
+        <w:spacing w:before="40" w:after="40"/>
+        <w:ind w:left="1080"/>
+      </w:pPr>
+      <w:r>
+        <w:rPr>
+          <w:i/>
+        </w:rPr>
+        <w:t>Resultado:</w:t>
+      </w:r>
+      <w:r>
+        <w:rPr>
+          <w:color w:val="2E7D32"/>
+        </w:rPr>
+        <w:t xml:space="preserve"> SUPERADA.</w:t>
+      </w:r>
+    </w:p>
+    <w:p>
+      <w:pPr>
+        <w:spacing w:before="60" w:after="60"/>
+        <w:ind w:left="720"/>
+      </w:pPr>
+      <w:r>
+        <w:rPr>
+          <w:b/>
+        </w:rPr>
+        <w:t>Prueba 2 — Login con credenciales incorrectas</w:t>
+      </w:r>
+    </w:p>
+    <w:p>
+      <w:pPr>
+        <w:spacing w:before="40" w:after="40"/>
+        <w:ind w:left="1080"/>
+      </w:pPr>
+      <w:r>
+        <w:rPr>
+          <w:i/>
+        </w:rPr>
+        <w:t>Planteamiento:</w:t>
+      </w:r>
+      <w:r>
+        <w:t xml:space="preserve"> Verificar que el sistema rechaza credenciales erróneas y muestra el mensaje de error adecuado.</w:t>
+      </w:r>
+    </w:p>
+    <w:p>
+      <w:pPr>
+        <w:spacing w:before="40" w:after="40"/>
+        <w:ind w:left="1080"/>
+      </w:pPr>
+      <w:r>
+        <w:rPr>
+          <w:i/>
+        </w:rPr>
+        <w:t>Entrada:</w:t>
+      </w:r>
+      <w:r>
+        <w:t xml:space="preserve"> Email válido con contraseña incorrecta.</w:t>
+      </w:r>
+    </w:p>
+    <w:p>
+      <w:pPr>
+        <w:spacing w:before="40" w:after="40"/>
+        <w:ind w:left="1080"/>
+      </w:pPr>
+      <w:r>
+        <w:rPr>
+          <w:i/>
+        </w:rPr>
+        <w:t>Salida prevista:</w:t>
+      </w:r>
+      <w:r>
+        <w:t xml:space="preserve"> Mensaje “Email o contraseña incorrectos” sin redirigir.</w:t>
+      </w:r>
+    </w:p>
+    <w:p>
+      <w:pPr>
+        <w:spacing w:before="40" w:after="40"/>
+        <w:ind w:left="1080"/>
+      </w:pPr>
+      <w:r>
+        <w:rPr>
+          <w:i/>
+        </w:rPr>
+        <w:t>Salida obtenida:</w:t>
+      </w:r>
+      <w:r>
+        <w:t xml:space="preserve"> El formulario vuelve a mostrarse con el mensaje de error correcto.</w:t>
+      </w:r>
+    </w:p>
+    <w:p>
+      <w:pPr>
+        <w:spacing w:before="40" w:after="40"/>
+        <w:ind w:left="1080"/>
+      </w:pPr>
+      <w:r>
+        <w:rPr>
+          <w:i/>
+        </w:rPr>
+        <w:t>Resultado:</w:t>
+      </w:r>
+      <w:r>
+        <w:rPr>
+          <w:color w:val="2E7D32"/>
+        </w:rPr>
+        <w:t xml:space="preserve"> SUPERADA.</w:t>
+      </w:r>
+    </w:p>
+    <w:p>
+      <w:pPr>
+        <w:spacing w:before="60" w:after="60"/>
+        <w:ind w:left="720"/>
+      </w:pPr>
+      <w:r>
+        <w:rPr>
+          <w:b/>
+        </w:rPr>
+        <w:t>Prueba 3 — Registro de nuevo usuario</w:t>
+      </w:r>
+    </w:p>
+    <w:p>
+      <w:pPr>
+        <w:spacing w:before="40" w:after="40"/>
+        <w:ind w:left="1080"/>
+      </w:pPr>
+      <w:r>
+        <w:rPr>
+          <w:i/>
+        </w:rPr>
+        <w:t>Planteamiento:</w:t>
+      </w:r>
+      <w:r>
+        <w:t xml:space="preserve"> Verificar que un nuevo usuario puede registrarse y acceder inmediatamente a la aplicación.</w:t>
+      </w:r>
+    </w:p>
+    <w:p>
+      <w:pPr>
+        <w:spacing w:before="40" w:after="40"/>
+        <w:ind w:left="1080"/>
+      </w:pPr>
+      <w:r>
+        <w:rPr>
+          <w:i/>
+        </w:rPr>
+        <w:lastRenderedPageBreak/>
+        <w:t>Entrada:</w:t>
+      </w:r>
+      <w:r>
+        <w:t xml:space="preserve"> Nombre, email nuevo y contraseña válidos.</w:t>
+      </w:r>
+    </w:p>
+    <w:p>
+      <w:pPr>
+        <w:spacing w:before="40" w:after="40"/>
+        <w:ind w:left="1080"/>
+      </w:pPr>
+      <w:r>
+        <w:rPr>
+          <w:i/>
+        </w:rPr>
+        <w:t>Salida prevista:</w:t>
+      </w:r>
+      <w:r>
+        <w:t xml:space="preserve"> Usuario creado con rol alumno y redirección al dashboard.</w:t>
+      </w:r>
+    </w:p>
+    <w:p>
+      <w:pPr>
+        <w:spacing w:before="40" w:after="40"/>
+        <w:ind w:left="1080"/>
+      </w:pPr>
+      <w:r>
+        <w:rPr>
+          <w:i/>
+        </w:rPr>
+        <w:t>Salida obtenida:</w:t>
+      </w:r>
+      <w:r>
+        <w:t xml:space="preserve"> El usuario queda registrado en la BD y accede correctamente al panel de alumno.</w:t>
+      </w:r>
+    </w:p>
+    <w:p>
+      <w:pPr>
+        <w:spacing w:before="40" w:after="40"/>
+        <w:ind w:left="1080"/>
+      </w:pPr>
+      <w:r>
+        <w:rPr>
+          <w:i/>
+        </w:rPr>
+        <w:t>Resultado:</w:t>
+      </w:r>
+      <w:r>
+        <w:rPr>
+          <w:color w:val="2E7D32"/>
+        </w:rPr>
+        <w:t xml:space="preserve"> SUPERADA.</w:t>
+      </w:r>
+    </w:p>
+    <w:p>
+      <w:pPr>
+        <w:spacing w:before="60" w:after="60"/>
+        <w:ind w:left="720"/>
+      </w:pPr>
+      <w:r>
+        <w:rPr>
+          <w:b/>
+        </w:rPr>
+        <w:t>Prueba 4 — Redirección por rol</w:t>
+      </w:r>
+    </w:p>
+    <w:p>
+      <w:pPr>
+        <w:spacing w:before="40" w:after="40"/>
+        <w:ind w:left="1080"/>
+      </w:pPr>
+      <w:r>
+        <w:rPr>
+          <w:i/>
+        </w:rPr>
+        <w:t>Planteamiento:</w:t>
+      </w:r>
+      <w:r>
+        <w:t xml:space="preserve"> Verificar que cada rol redirige a su panel correspondiente tras el login.</w:t>
+      </w:r>
+    </w:p>
+    <w:p>
+      <w:pPr>
+        <w:spacing w:before="40" w:after="40"/>
+        <w:ind w:left="1080"/>
+      </w:pPr>
+      <w:r>
+        <w:rPr>
+          <w:i/>
+        </w:rPr>
+        <w:t>Entrada:</w:t>
+      </w:r>
+      <w:r>
+        <w:t xml:space="preserve"> Login con usuario admin y login con usuario alumno.</w:t>
+      </w:r>
+    </w:p>
+    <w:p>
+      <w:pPr>
+        <w:spacing w:before="40" w:after="40"/>
+        <w:ind w:left="1080"/>
+      </w:pPr>
+      <w:r>
+        <w:rPr>
+          <w:i/>
+        </w:rPr>
+        <w:t>Salida prevista:</w:t>
+      </w:r>
+      <w:r>
+        <w:t xml:space="preserve"> Admin → /admin/index. Alumno → /student/index.</w:t>
+      </w:r>
+    </w:p>
+    <w:p>
+      <w:pPr>
+        <w:spacing w:before="40" w:after="40"/>
+        <w:ind w:left="1080"/>
+      </w:pPr>
+      <w:r>
+        <w:rPr>
+          <w:i/>
+        </w:rPr>
+        <w:t>Salida obtenida:</w:t>
+      </w:r>
+      <w:r>
+        <w:t xml:space="preserve"> Cada usuario accede a su panel correcto según el rol almacenado en la sesión.</w:t>
+      </w:r>
+    </w:p>
+    <w:p>
+      <w:pPr>
+        <w:spacing w:before="40" w:after="40"/>
+        <w:ind w:left="1080"/>
+      </w:pPr>
+      <w:r>
+        <w:rPr>
+          <w:i/>
+        </w:rPr>
+        <w:t>Resultado:</w:t>
+      </w:r>
+      <w:r>
+        <w:rPr>
+          <w:color w:val="2E7D32"/>
+        </w:rPr>
+        <w:t xml:space="preserve"> SUPERADA.</w:t>
+      </w:r>
+    </w:p>
+    <w:p>
+      <w:pPr>
+        <w:spacing w:before="60" w:after="60"/>
+        <w:ind w:left="720"/>
+      </w:pPr>
+      <w:r>
+        <w:rPr>
+          <w:b/>
+        </w:rPr>
+        <w:t>Prueba 5 — Protección de rutas sin sesión</w:t>
+      </w:r>
+    </w:p>
+    <w:p>
+      <w:pPr>
+        <w:spacing w:before="40" w:after="40"/>
+        <w:ind w:left="1080"/>
+      </w:pPr>
+      <w:r>
+        <w:rPr>
+          <w:i/>
+        </w:rPr>
+        <w:t>Planteamiento:</w:t>
+      </w:r>
+      <w:r>
+        <w:t xml:space="preserve"> Verificar que un usuario no autenticado no puede acceder directamente al panel.</w:t>
+      </w:r>
+    </w:p>
+    <w:p>
+      <w:pPr>
+        <w:spacing w:before="40" w:after="40"/>
+        <w:ind w:left="1080"/>
+      </w:pPr>
+      <w:r>
+        <w:rPr>
+          <w:i/>
+        </w:rPr>
+        <w:t>Entrada:</w:t>
+      </w:r>
+      <w:r>
+        <w:t xml:space="preserve"> Acceso directo a /admin/index sin haber iniciado sesión.</w:t>
+      </w:r>
+    </w:p>
+    <w:p>
+      <w:pPr>
+        <w:spacing w:before="40" w:after="40"/>
+        <w:ind w:left="1080"/>
+      </w:pPr>
+      <w:r>
+        <w:rPr>
+          <w:i/>
+        </w:rPr>
+        <w:t>Salida prevista:</w:t>
+      </w:r>
+      <w:r>
+        <w:t xml:space="preserve"> Redirección automática al login.</w:t>
+      </w:r>
+    </w:p>
+    <w:p>
+      <w:pPr>
+        <w:spacing w:before="40" w:after="40"/>
+        <w:ind w:left="1080"/>
+      </w:pPr>
+      <w:r>
+        <w:rPr>
+          <w:i/>
+        </w:rPr>
+        <w:t>Salida obtenida:</w:t>
+      </w:r>
+      <w:r>
+        <w:t xml:space="preserve"> El controlador detecta la ausencia de sesión y redirige al formulario de login.</w:t>
+      </w:r>
+    </w:p>
+    <w:p>
+      <w:pPr>
+        <w:spacing w:before="40" w:after="40"/>
+        <w:ind w:left="1080"/>
+      </w:pPr>
+      <w:r>
+        <w:rPr>
+          <w:i/>
+        </w:rPr>
+        <w:t>Resultado:</w:t>
+      </w:r>
+      <w:r>
+        <w:rPr>
+          <w:color w:val="2E7D32"/>
+        </w:rPr>
+        <w:t xml:space="preserve"> SUPERADA.</w:t>
+      </w:r>
+    </w:p>
+    <w:p>
+      <w:r>
+        <w:t>4.4. Dificultades Encontradas</w:t>
+      </w:r>
+    </w:p>
+    <w:p>
+      <w:pPr>
+        <w:spacing w:before="60" w:after="60"/>
+        <w:ind w:left="720"/>
+      </w:pPr>
+      <w:r>
+        <w:rPr>
+          <w:b/>
+        </w:rPr>
+        <w:t>Dificultad 1 — Bloqueo de Docker Hub por el ISP</w:t>
+      </w:r>
+    </w:p>
+    <w:p>
+      <w:pPr>
+        <w:spacing w:before="40" w:after="40"/>
+        <w:ind w:left="1080"/>
+      </w:pPr>
+      <w:r>
+        <w:t>Al ejecutar docker-compose up --build por primera vez, la descarga de la imagen postgres:16 fallaba con un error de conexión a la dirección IP 172.64.66.1 (Cloudflare). El proveedor de internet bloqueaba el acceso a los servidores de almacenamiento de imágenes de Docker Hub.</w:t>
+      </w:r>
+    </w:p>
+    <w:p>
+      <w:pPr>
+        <w:spacing w:before="40" w:after="40"/>
+        <w:ind w:left="1080"/>
+      </w:pPr>
+      <w:r>
+        <w:rPr>
+          <w:i/>
+        </w:rPr>
+        <w:t>Solución:</w:t>
+      </w:r>
+      <w:r>
+        <w:t xml:space="preserve"> Se configuraron mirrors alternativos de Docker Hub en Docker Desktop (mirror.gcr.io y docker.mirrors.ustc.edu.cn), lo que permitió descargar las imágenes correctamente sin cambiar de red.</w:t>
+      </w:r>
+    </w:p>
+    <w:p>
+      <w:pPr>
+        <w:spacing w:before="60" w:after="60"/>
+        <w:ind w:left="720"/>
+      </w:pPr>
+      <w:r>
+        <w:rPr>
+          <w:b/>
+        </w:rPr>
+        <w:t>Dificultad 2 — Hash de contraseña con caracteres escapados</w:t>
+      </w:r>
+    </w:p>
+    <w:p>
+      <w:pPr>
+        <w:spacing w:before="40" w:after="40"/>
+        <w:ind w:left="1080"/>
+      </w:pPr>
+      <w:r>
+        <w:t>El hash bcrypt del usuario administrador insertado en init.sql se almacenó con barras invertidas delante de los símbolos $ (por ejemplo \$2y\$ en lugar de $2y$), lo que impeda que password_verify() de PHP lo validara correctamente.</w:t>
+      </w:r>
+    </w:p>
+    <w:p>
+      <w:pPr>
+        <w:spacing w:before="40" w:after="40"/>
+        <w:ind w:left="1080"/>
+      </w:pPr>
+      <w:r>
+        <w:rPr>
+          <w:i/>
+        </w:rPr>
+        <w:t>Solución:</w:t>
+      </w:r>
+      <w:r>
+        <w:t xml:space="preserve"> Se generó el hash correcto directamente desde el contenedor PHP con docker exec y se actualizó el registro en la base de datos mediante un comando UPDATE en psql. Además, se corrigió el init.sql para que futuras instalaciones no repitan el error.</w:t>
+      </w:r>
+    </w:p>
+    <w:p>
+      <w:r>
+        <w:t>4.5. Documentación del Proceso</w:t>
+      </w:r>
+    </w:p>
+    <w:p>
+      <w:pPr>
+        <w:spacing w:before="80" w:after="80"/>
+      </w:pPr>
+      <w:r>
+        <w:t>El código fuente de la aplicación está disponible en el repositorio público de GitHub:</w:t>
+      </w:r>
+    </w:p>
+    <w:p>
+      <w:pPr>
+        <w:spacing w:before="60" w:after="60"/>
+        <w:jc w:val="center"/>
+      </w:pPr>
+      <w:r>
+        <w:rPr>
+          <w:rFonts w:ascii="Courier New" w:hAnsi="Courier New"/>
+          <w:b/>
+          <w:sz w:val="22"/>
+        </w:rPr>
+        <w:t>https://github.com/NestorSoftware/GeoLearn</w:t>
+      </w:r>
+    </w:p>
+    <w:p>
+      <w:pPr>
+        <w:spacing w:before="80" w:after="80"/>
+      </w:pPr>
+      <w:r>
+        <w:t>Todos los archivos del proyecto cuentan con comentarios explicativos en el código que describen la función de cada clase, método y bloque relevante. La estructura de directorios sigue estrictamente la arquitectura MVC definida en el anteproyecto.</w:t>
+      </w:r>
+    </w:p>
+    <w:p>
+      <w:pPr>
+        <w:spacing w:before="80" w:after="80"/>
+      </w:pPr>
+      <w:r>
+        <w:t xml:space="preserve">Para arrancar el proyecto en cualquier máquina con Docker instalado basta con ejecutar el comando </w:t>
+      </w:r>
+      <w:r>
+        <w:rPr>
+          <w:rFonts w:ascii="Courier New" w:hAnsi="Courier New"/>
+        </w:rPr>
+        <w:t>docker-compose up --build</w:t>
+      </w:r>
+      <w:r>
+        <w:t xml:space="preserve"> desde la raíz del proyecto. La base de datos se inicializa automáticamente con las tablas y el usuario administrador por defecto (admin@geolearn.com / admin1234).</w:t>
+      </w:r>
+    </w:p>
     <w:sectPr>
       <w:headerReference w:type="default" r:id="rId12"/>
       <w:footerReference w:type="default" r:id="rId13"/>
@@ -20828,7 +20588,25 @@
         <w:sz w:val="17"/>
         <w:szCs w:val="17"/>
       </w:rPr>
-      <w:t>Néstor Pérez Santos  —  DAW 2.º</w:t>
+      <w:t xml:space="preserve">Néstor Pérez </w:t>
+    </w:r>
+    <w:proofErr w:type="gramStart"/>
+    <w:r>
+      <w:rPr>
+        <w:color w:val="555555"/>
+        <w:sz w:val="17"/>
+        <w:szCs w:val="17"/>
+      </w:rPr>
+      <w:t>Santos  —</w:t>
+    </w:r>
+    <w:proofErr w:type="gramEnd"/>
+    <w:r>
+      <w:rPr>
+        <w:color w:val="555555"/>
+        <w:sz w:val="17"/>
+        <w:szCs w:val="17"/>
+      </w:rPr>
+      <w:t xml:space="preserve">  DAW 2.º</w:t>
     </w:r>
   </w:p>
 </w:ftr>
@@ -20865,13 +20643,33 @@
       </w:tabs>
       <w:spacing w:after="80"/>
     </w:pPr>
+    <w:proofErr w:type="spellStart"/>
+    <w:proofErr w:type="gramStart"/>
     <w:r>
       <w:rPr>
         <w:color w:val="555555"/>
         <w:sz w:val="17"/>
         <w:szCs w:val="17"/>
       </w:rPr>
-      <w:t xml:space="preserve">GeoLearn  |  1.ª Entrega: </w:t>
+      <w:t>GeoLearn</w:t>
+    </w:r>
+    <w:proofErr w:type="spellEnd"/>
+    <w:r>
+      <w:rPr>
+        <w:color w:val="555555"/>
+        <w:sz w:val="17"/>
+        <w:szCs w:val="17"/>
+      </w:rPr>
+      <w:t xml:space="preserve">  |</w:t>
+    </w:r>
+    <w:proofErr w:type="gramEnd"/>
+    <w:r>
+      <w:rPr>
+        <w:color w:val="555555"/>
+        <w:sz w:val="17"/>
+        <w:szCs w:val="17"/>
+      </w:rPr>
+      <w:t xml:space="preserve">  1.ª Entrega: </w:t>
     </w:r>
     <w:r>
       <w:rPr>

</xml_diff>

<commit_message>
feat: version final - sistema de juego, API REST, estadisticas y panel admin completo
</commit_message>
<xml_diff>
--- a/docs/GeoLearn_Nestor.docx
+++ b/docs/GeoLearn_Nestor.docx
@@ -19620,9 +19620,6 @@
           <w:p>
             <w:pPr>
               <w:spacing w:before="20" w:after="20"/>
-              <w:rPr>
-                <w:lang w:val="en-US"/>
-              </w:rPr>
             </w:pPr>
             <w:r>
               <w:rPr>
@@ -19630,7 +19627,6 @@
                 <w:color w:val="222222"/>
                 <w:sz w:val="18"/>
                 <w:szCs w:val="18"/>
-                <w:lang w:val="en-US"/>
               </w:rPr>
               <w:t xml:space="preserve">|       `-- </w:t>
             </w:r>
@@ -19641,7 +19637,6 @@
                 <w:color w:val="222222"/>
                 <w:sz w:val="18"/>
                 <w:szCs w:val="18"/>
-                <w:lang w:val="en-US"/>
               </w:rPr>
               <w:t>js</w:t>
             </w:r>
@@ -19652,7 +19647,6 @@
                 <w:color w:val="222222"/>
                 <w:sz w:val="18"/>
                 <w:szCs w:val="18"/>
-                <w:lang w:val="en-US"/>
               </w:rPr>
               <w:t xml:space="preserve">/game.js      &lt;- </w:t>
             </w:r>
@@ -19663,7 +19657,6 @@
                 <w:color w:val="222222"/>
                 <w:sz w:val="18"/>
                 <w:szCs w:val="18"/>
-                <w:lang w:val="en-US"/>
               </w:rPr>
               <w:t>logica</w:t>
             </w:r>
@@ -19674,10 +19667,10 @@
                 <w:color w:val="222222"/>
                 <w:sz w:val="18"/>
                 <w:szCs w:val="18"/>
-                <w:lang w:val="en-US"/>
               </w:rPr>
               <w:t xml:space="preserve"> del trivial con </w:t>
             </w:r>
+            <w:proofErr w:type="spellStart"/>
             <w:proofErr w:type="gramStart"/>
             <w:r>
               <w:rPr>
@@ -19685,46 +19678,33 @@
                 <w:color w:val="222222"/>
                 <w:sz w:val="18"/>
                 <w:szCs w:val="18"/>
-                <w:lang w:val="en-US"/>
-              </w:rPr>
-              <w:t>fetch(</w:t>
-            </w:r>
-            <w:proofErr w:type="gramEnd"/>
+              </w:rPr>
+              <w:t>fetch</w:t>
+            </w:r>
+            <w:proofErr w:type="spellEnd"/>
             <w:r>
               <w:rPr>
                 <w:rFonts w:ascii="Courier New" w:eastAsia="Courier New" w:hAnsi="Courier New" w:cs="Courier New"/>
                 <w:color w:val="222222"/>
                 <w:sz w:val="18"/>
                 <w:szCs w:val="18"/>
-                <w:lang w:val="en-US"/>
-              </w:rPr>
-              <w:t>)</w:t>
-            </w:r>
-          </w:p>
-          <w:p>
-            <w:pPr>
-              <w:spacing w:before="20" w:after="20"/>
-              <w:rPr>
-                <w:lang w:val="en-US"/>
-              </w:rPr>
-            </w:pPr>
+              </w:rPr>
+              <w:t>(</w:t>
+            </w:r>
+            <w:proofErr w:type="gramEnd"/>
             <w:r>
               <w:rPr>
                 <w:rFonts w:ascii="Courier New" w:eastAsia="Courier New" w:hAnsi="Courier New" w:cs="Courier New"/>
                 <w:color w:val="222222"/>
                 <w:sz w:val="18"/>
                 <w:szCs w:val="18"/>
-                <w:lang w:val="en-US"/>
-              </w:rPr>
-              <w:t>|</w:t>
+              </w:rPr>
+              <w:t>)</w:t>
             </w:r>
           </w:p>
           <w:p>
             <w:pPr>
               <w:spacing w:before="20" w:after="20"/>
-              <w:rPr>
-                <w:lang w:val="en-US"/>
-              </w:rPr>
             </w:pPr>
             <w:r>
               <w:rPr>
@@ -19732,9 +19712,8 @@
                 <w:color w:val="222222"/>
                 <w:sz w:val="18"/>
                 <w:szCs w:val="18"/>
-                <w:lang w:val="en-US"/>
-              </w:rPr>
-              <w:t>`-- database/</w:t>
+              </w:rPr>
+              <w:t>|</w:t>
             </w:r>
           </w:p>
           <w:p>
@@ -19747,7 +19726,40 @@
                 <w:color w:val="222222"/>
                 <w:sz w:val="18"/>
                 <w:szCs w:val="18"/>
-                <w:lang w:val="en-US"/>
+              </w:rPr>
+              <w:t xml:space="preserve">`-- </w:t>
+            </w:r>
+            <w:proofErr w:type="spellStart"/>
+            <w:r>
+              <w:rPr>
+                <w:rFonts w:ascii="Courier New" w:eastAsia="Courier New" w:hAnsi="Courier New" w:cs="Courier New"/>
+                <w:color w:val="222222"/>
+                <w:sz w:val="18"/>
+                <w:szCs w:val="18"/>
+              </w:rPr>
+              <w:t>database</w:t>
+            </w:r>
+            <w:proofErr w:type="spellEnd"/>
+            <w:r>
+              <w:rPr>
+                <w:rFonts w:ascii="Courier New" w:eastAsia="Courier New" w:hAnsi="Courier New" w:cs="Courier New"/>
+                <w:color w:val="222222"/>
+                <w:sz w:val="18"/>
+                <w:szCs w:val="18"/>
+              </w:rPr>
+              <w:t>/</w:t>
+            </w:r>
+          </w:p>
+          <w:p>
+            <w:pPr>
+              <w:spacing w:before="20" w:after="20"/>
+            </w:pPr>
+            <w:r>
+              <w:rPr>
+                <w:rFonts w:ascii="Courier New" w:eastAsia="Courier New" w:hAnsi="Courier New" w:cs="Courier New"/>
+                <w:color w:val="222222"/>
+                <w:sz w:val="18"/>
+                <w:szCs w:val="18"/>
               </w:rPr>
               <w:t xml:space="preserve">    </w:t>
             </w:r>
@@ -20541,6 +20553,664 @@
       <w:r>
         <w:t xml:space="preserve"> desde la raíz del proyecto. La base de datos se inicializa automáticamente con las tablas y el usuario administrador por defecto (admin@geolearn.com / admin1234).</w:t>
       </w:r>
+    </w:p>
+    <w:p>
+      <w:pPr>
+        <w:spacing w:before="80" w:after="80"/>
+      </w:pPr>
+    </w:p>
+    <w:p>
+      <w:pPr>
+        <w:spacing w:before="80" w:after="80"/>
+      </w:pPr>
+    </w:p>
+    <w:p>
+      <w:pPr>
+        <w:spacing w:before="80" w:after="80"/>
+      </w:pPr>
+    </w:p>
+    <w:p>
+      <w:pPr>
+        <w:spacing w:before="80" w:after="80"/>
+      </w:pPr>
+    </w:p>
+    <w:p>
+      <w:pPr>
+        <w:spacing w:before="80" w:after="80"/>
+      </w:pPr>
+    </w:p>
+    <w:p>
+      <w:pPr>
+        <w:spacing w:before="80" w:after="80"/>
+      </w:pPr>
+      <w:r>
+        <w:t>5. Segunda Versión del Proyecto</w:t>
+      </w:r>
+    </w:p>
+    <w:p>
+      <w:pPr>
+        <w:spacing w:before="80" w:after="80"/>
+      </w:pPr>
+      <w:r>
+        <w:lastRenderedPageBreak/>
+        <w:t xml:space="preserve">Esta sección documenta el trabajo realizado en la tercera entrega del proyecto </w:t>
+      </w:r>
+      <w:proofErr w:type="spellStart"/>
+      <w:r>
+        <w:t>GeoLearn</w:t>
+      </w:r>
+      <w:proofErr w:type="spellEnd"/>
+      <w:r>
+        <w:t xml:space="preserve">. En esta fase se ha completado el panel del profesor con la gestión completa de cursos y preguntas, y se ha conectado con el </w:t>
+      </w:r>
+      <w:proofErr w:type="spellStart"/>
+      <w:r>
+        <w:t>dashboard</w:t>
+      </w:r>
+      <w:proofErr w:type="spellEnd"/>
+      <w:r>
+        <w:t xml:space="preserve"> del alumno para que pueda ver los cursos publicados.</w:t>
+      </w:r>
+    </w:p>
+    <w:p>
+      <w:pPr>
+        <w:spacing w:before="80" w:after="80"/>
+      </w:pPr>
+      <w:r>
+        <w:t>5.1. Lo que se ha implementado</w:t>
+      </w:r>
+    </w:p>
+    <w:p>
+      <w:pPr>
+        <w:spacing w:before="80" w:after="80"/>
+      </w:pPr>
+      <w:r>
+        <w:t>Respecto a la entrega anterior, se han añadido las siguientes funcionalidades:</w:t>
+      </w:r>
+    </w:p>
+    <w:p>
+      <w:pPr>
+        <w:spacing w:before="80" w:after="80"/>
+      </w:pPr>
+      <w:r>
+        <w:rPr>
+          <w:b/>
+        </w:rPr>
+        <w:t>Panel del profesor:</w:t>
+      </w:r>
+      <w:r>
+        <w:t xml:space="preserve"> El profesor tiene ahora su propio panel donde puede ver todos los cursos que ha creado. Desde ahí puede acceder al detalle de cada uno, editarlo, publicarlo o eliminarlo.</w:t>
+      </w:r>
+    </w:p>
+    <w:p>
+      <w:pPr>
+        <w:spacing w:before="80" w:after="80"/>
+      </w:pPr>
+      <w:r>
+        <w:rPr>
+          <w:b/>
+        </w:rPr>
+        <w:t>Creación y edición de cursos:</w:t>
+      </w:r>
+      <w:r>
+        <w:t xml:space="preserve"> El profesor puede crear cursos nuevos con título, descripción y categoría (Historia, Geografía o Mixto). También puede editarlos y decidir si publicarlos o mantenerlos como borrador.</w:t>
+      </w:r>
+    </w:p>
+    <w:p>
+      <w:pPr>
+        <w:spacing w:before="80" w:after="80"/>
+      </w:pPr>
+      <w:r>
+        <w:rPr>
+          <w:b/>
+        </w:rPr>
+        <w:t>Banco de preguntas:</w:t>
+      </w:r>
+      <w:r>
+        <w:t xml:space="preserve"> Dentro de cada curso el profesor puede añadir preguntas de opción múltiple con cuatro opciones (A, B, C, D), indicando cuál es la correcta y el nivel de dificultad. También puede eliminar preguntas.</w:t>
+      </w:r>
+    </w:p>
+    <w:p>
+      <w:pPr>
+        <w:spacing w:before="80" w:after="80"/>
+      </w:pPr>
+      <w:proofErr w:type="spellStart"/>
+      <w:r>
+        <w:rPr>
+          <w:b/>
+        </w:rPr>
+        <w:t>Dashboard</w:t>
+      </w:r>
+      <w:proofErr w:type="spellEnd"/>
+      <w:r>
+        <w:rPr>
+          <w:b/>
+        </w:rPr>
+        <w:t xml:space="preserve"> del alumno actualizado:</w:t>
+      </w:r>
+      <w:r>
+        <w:t xml:space="preserve"> El alumno ya puede ver en su panel los cursos que están publicados, con su categoría, descripción y el nombre del profesor que lo imparte. El botón de jugar está preparado para la siguiente entrega.</w:t>
+      </w:r>
+    </w:p>
+    <w:p>
+      <w:pPr>
+        <w:spacing w:before="80" w:after="80"/>
+      </w:pPr>
+      <w:r>
+        <w:rPr>
+          <w:b/>
+        </w:rPr>
+        <w:t>Nuevos archivos creados:</w:t>
+      </w:r>
+      <w:r>
+        <w:t xml:space="preserve"> Se han añadido los modelos </w:t>
+      </w:r>
+      <w:proofErr w:type="spellStart"/>
+      <w:r>
+        <w:t>Curso.php</w:t>
+      </w:r>
+      <w:proofErr w:type="spellEnd"/>
+      <w:r>
+        <w:t xml:space="preserve"> y </w:t>
+      </w:r>
+      <w:proofErr w:type="spellStart"/>
+      <w:r>
+        <w:t>Pregunta.php</w:t>
+      </w:r>
+      <w:proofErr w:type="spellEnd"/>
+      <w:r>
+        <w:t xml:space="preserve">, el controlador </w:t>
+      </w:r>
+      <w:proofErr w:type="spellStart"/>
+      <w:r>
+        <w:t>CourseController.php</w:t>
+      </w:r>
+      <w:proofErr w:type="spellEnd"/>
+      <w:r>
+        <w:t xml:space="preserve"> y las vistas </w:t>
+      </w:r>
+      <w:proofErr w:type="spellStart"/>
+      <w:r>
+        <w:t>course</w:t>
+      </w:r>
+      <w:proofErr w:type="spellEnd"/>
+      <w:r>
+        <w:t>/</w:t>
+      </w:r>
+      <w:proofErr w:type="spellStart"/>
+      <w:r>
+        <w:t>index.php</w:t>
+      </w:r>
+      <w:proofErr w:type="spellEnd"/>
+      <w:r>
+        <w:t xml:space="preserve">, </w:t>
+      </w:r>
+      <w:proofErr w:type="spellStart"/>
+      <w:r>
+        <w:t>course</w:t>
+      </w:r>
+      <w:proofErr w:type="spellEnd"/>
+      <w:r>
+        <w:t>/</w:t>
+      </w:r>
+      <w:proofErr w:type="spellStart"/>
+      <w:r>
+        <w:t>crear.php</w:t>
+      </w:r>
+      <w:proofErr w:type="spellEnd"/>
+      <w:r>
+        <w:t xml:space="preserve">, </w:t>
+      </w:r>
+      <w:proofErr w:type="spellStart"/>
+      <w:r>
+        <w:t>course</w:t>
+      </w:r>
+      <w:proofErr w:type="spellEnd"/>
+      <w:r>
+        <w:t>/</w:t>
+      </w:r>
+      <w:proofErr w:type="spellStart"/>
+      <w:r>
+        <w:t>ver.php</w:t>
+      </w:r>
+      <w:proofErr w:type="spellEnd"/>
+      <w:r>
+        <w:t xml:space="preserve">, </w:t>
+      </w:r>
+      <w:proofErr w:type="spellStart"/>
+      <w:r>
+        <w:t>course</w:t>
+      </w:r>
+      <w:proofErr w:type="spellEnd"/>
+      <w:r>
+        <w:t>/</w:t>
+      </w:r>
+      <w:proofErr w:type="spellStart"/>
+      <w:r>
+        <w:t>editar.php</w:t>
+      </w:r>
+      <w:proofErr w:type="spellEnd"/>
+      <w:r>
+        <w:t xml:space="preserve"> y </w:t>
+      </w:r>
+      <w:proofErr w:type="spellStart"/>
+      <w:r>
+        <w:t>course</w:t>
+      </w:r>
+      <w:proofErr w:type="spellEnd"/>
+      <w:r>
+        <w:t>/</w:t>
+      </w:r>
+      <w:proofErr w:type="spellStart"/>
+      <w:r>
+        <w:t>pregunta.php</w:t>
+      </w:r>
+      <w:proofErr w:type="spellEnd"/>
+      <w:r>
+        <w:t>.</w:t>
+      </w:r>
+    </w:p>
+    <w:p>
+      <w:pPr>
+        <w:spacing w:before="80" w:after="80"/>
+      </w:pPr>
+      <w:r>
+        <w:t>5.2. Variaciones respecto al anteproyecto</w:t>
+      </w:r>
+    </w:p>
+    <w:p>
+      <w:pPr>
+        <w:spacing w:before="80" w:after="80"/>
+      </w:pPr>
+      <w:r>
+        <w:t>No ha habido cambios en los objetivos ni en el diseño de la base de datos. La planificación temporal se ha cumplido según lo previsto en la Fase 2 del anteproyecto.</w:t>
+      </w:r>
+    </w:p>
+    <w:p>
+      <w:pPr>
+        <w:spacing w:before="80" w:after="80"/>
+      </w:pPr>
+      <w:r>
+        <w:t>5.3. Pruebas realizadas</w:t>
+      </w:r>
+    </w:p>
+    <w:p>
+      <w:pPr>
+        <w:spacing w:before="80" w:after="80"/>
+      </w:pPr>
+      <w:r>
+        <w:rPr>
+          <w:b/>
+        </w:rPr>
+        <w:t>Prueba 1 — Crear un curso</w:t>
+      </w:r>
+    </w:p>
+    <w:p>
+      <w:pPr>
+        <w:spacing w:before="80" w:after="80"/>
+      </w:pPr>
+      <w:r>
+        <w:rPr>
+          <w:i/>
+        </w:rPr>
+        <w:t>Motivo:</w:t>
+      </w:r>
+      <w:r>
+        <w:t xml:space="preserve"> Verificar que el profesor puede crear un curso correctamente y que queda guardado en la base de datos.</w:t>
+      </w:r>
+    </w:p>
+    <w:p>
+      <w:pPr>
+        <w:spacing w:before="80" w:after="80"/>
+      </w:pPr>
+      <w:r>
+        <w:rPr>
+          <w:i/>
+        </w:rPr>
+        <w:t>Entrada:</w:t>
+      </w:r>
+      <w:r>
+        <w:t xml:space="preserve"> Título, descripción y categoría válidos.</w:t>
+      </w:r>
+    </w:p>
+    <w:p>
+      <w:pPr>
+        <w:spacing w:before="80" w:after="80"/>
+      </w:pPr>
+      <w:r>
+        <w:rPr>
+          <w:i/>
+        </w:rPr>
+        <w:t>Salida prevista:</w:t>
+      </w:r>
+      <w:r>
+        <w:t xml:space="preserve"> Redirección a la página de detalle del curso recién creado.</w:t>
+      </w:r>
+    </w:p>
+    <w:p>
+      <w:pPr>
+        <w:spacing w:before="80" w:after="80"/>
+      </w:pPr>
+      <w:r>
+        <w:rPr>
+          <w:i/>
+        </w:rPr>
+        <w:t>Salida obtenida:</w:t>
+      </w:r>
+      <w:r>
+        <w:t xml:space="preserve"> El curso se crea correctamente y aparece en la lista del profesor.</w:t>
+      </w:r>
+    </w:p>
+    <w:p>
+      <w:pPr>
+        <w:spacing w:before="80" w:after="80"/>
+      </w:pPr>
+      <w:r>
+        <w:rPr>
+          <w:i/>
+        </w:rPr>
+        <w:t>Resultado:</w:t>
+      </w:r>
+      <w:r>
+        <w:t xml:space="preserve"> SUPERADA.</w:t>
+      </w:r>
+    </w:p>
+    <w:p>
+      <w:pPr>
+        <w:spacing w:before="80" w:after="80"/>
+      </w:pPr>
+      <w:r>
+        <w:rPr>
+          <w:b/>
+        </w:rPr>
+        <w:t>Prueba 2 — Añadir preguntas a un curso</w:t>
+      </w:r>
+    </w:p>
+    <w:p>
+      <w:pPr>
+        <w:spacing w:before="80" w:after="80"/>
+      </w:pPr>
+      <w:r>
+        <w:rPr>
+          <w:i/>
+        </w:rPr>
+        <w:t>Motivo:</w:t>
+      </w:r>
+      <w:r>
+        <w:t xml:space="preserve"> Comprobar que el banco de preguntas funciona correctamente.</w:t>
+      </w:r>
+    </w:p>
+    <w:p>
+      <w:pPr>
+        <w:spacing w:before="80" w:after="80"/>
+      </w:pPr>
+      <w:r>
+        <w:rPr>
+          <w:i/>
+        </w:rPr>
+        <w:t>Entrada:</w:t>
+      </w:r>
+      <w:r>
+        <w:t xml:space="preserve"> Enunciado, cuatro opciones, respuesta correcta y dificultad.</w:t>
+      </w:r>
+    </w:p>
+    <w:p>
+      <w:pPr>
+        <w:spacing w:before="80" w:after="80"/>
+      </w:pPr>
+      <w:r>
+        <w:rPr>
+          <w:i/>
+        </w:rPr>
+        <w:t>Salida prevista:</w:t>
+      </w:r>
+      <w:r>
+        <w:t xml:space="preserve"> La pregunta aparece en la tabla del curso.</w:t>
+      </w:r>
+    </w:p>
+    <w:p>
+      <w:pPr>
+        <w:spacing w:before="80" w:after="80"/>
+      </w:pPr>
+      <w:r>
+        <w:rPr>
+          <w:i/>
+        </w:rPr>
+        <w:t>Salida obtenida:</w:t>
+      </w:r>
+      <w:r>
+        <w:t xml:space="preserve"> Correcto, la pregunta queda registrada y se muestra en la tabla.</w:t>
+      </w:r>
+    </w:p>
+    <w:p>
+      <w:pPr>
+        <w:spacing w:before="80" w:after="80"/>
+      </w:pPr>
+      <w:r>
+        <w:rPr>
+          <w:i/>
+        </w:rPr>
+        <w:t>Resultado:</w:t>
+      </w:r>
+      <w:r>
+        <w:t xml:space="preserve"> SUPERADA.</w:t>
+      </w:r>
+    </w:p>
+    <w:p>
+      <w:pPr>
+        <w:spacing w:before="80" w:after="80"/>
+      </w:pPr>
+      <w:r>
+        <w:rPr>
+          <w:b/>
+        </w:rPr>
+        <w:t>Prueba 3 — Publicar un curso y verlo como alumno</w:t>
+      </w:r>
+    </w:p>
+    <w:p>
+      <w:pPr>
+        <w:spacing w:before="80" w:after="80"/>
+      </w:pPr>
+      <w:r>
+        <w:rPr>
+          <w:i/>
+        </w:rPr>
+        <w:t>Motivo:</w:t>
+      </w:r>
+      <w:r>
+        <w:t xml:space="preserve"> Verificar que solo los cursos publicados son visibles para los alumnos.</w:t>
+      </w:r>
+    </w:p>
+    <w:p>
+      <w:pPr>
+        <w:spacing w:before="80" w:after="80"/>
+      </w:pPr>
+      <w:r>
+        <w:rPr>
+          <w:i/>
+        </w:rPr>
+        <w:t>Entrada:</w:t>
+      </w:r>
+      <w:r>
+        <w:t xml:space="preserve"> Publicar un curso desde el panel del profesor y acceder con una cuenta de alumno.</w:t>
+      </w:r>
+    </w:p>
+    <w:p>
+      <w:pPr>
+        <w:spacing w:before="80" w:after="80"/>
+      </w:pPr>
+      <w:r>
+        <w:rPr>
+          <w:i/>
+        </w:rPr>
+        <w:t>Salida prevista:</w:t>
+      </w:r>
+      <w:r>
+        <w:t xml:space="preserve"> El curso aparece en el </w:t>
+      </w:r>
+      <w:proofErr w:type="spellStart"/>
+      <w:r>
+        <w:t>dashboard</w:t>
+      </w:r>
+      <w:proofErr w:type="spellEnd"/>
+      <w:r>
+        <w:t xml:space="preserve"> del alumno.</w:t>
+      </w:r>
+    </w:p>
+    <w:p>
+      <w:pPr>
+        <w:spacing w:before="80" w:after="80"/>
+      </w:pPr>
+      <w:r>
+        <w:rPr>
+          <w:i/>
+        </w:rPr>
+        <w:t>Salida obtenida:</w:t>
+      </w:r>
+      <w:r>
+        <w:t xml:space="preserve"> El alumno ve el curso con su categoría, descripción y nombre del profesor.</w:t>
+      </w:r>
+    </w:p>
+    <w:p>
+      <w:pPr>
+        <w:spacing w:before="80" w:after="80"/>
+      </w:pPr>
+      <w:r>
+        <w:rPr>
+          <w:i/>
+        </w:rPr>
+        <w:t>Resultado:</w:t>
+      </w:r>
+      <w:r>
+        <w:t xml:space="preserve"> SUPERADA.</w:t>
+      </w:r>
+    </w:p>
+    <w:p>
+      <w:pPr>
+        <w:spacing w:before="80" w:after="80"/>
+      </w:pPr>
+      <w:r>
+        <w:t>5.4. Dificultades encontradas</w:t>
+      </w:r>
+    </w:p>
+    <w:p>
+      <w:pPr>
+        <w:spacing w:before="80" w:after="80"/>
+      </w:pPr>
+      <w:r>
+        <w:rPr>
+          <w:b/>
+        </w:rPr>
+        <w:t xml:space="preserve">Problema con caracteres especiales en las </w:t>
+      </w:r>
+      <w:proofErr w:type="spellStart"/>
+      <w:r>
+        <w:rPr>
+          <w:b/>
+        </w:rPr>
+        <w:t>URLs</w:t>
+      </w:r>
+      <w:proofErr w:type="spellEnd"/>
+    </w:p>
+    <w:p>
+      <w:pPr>
+        <w:spacing w:before="80" w:after="80"/>
+      </w:pPr>
+      <w:r>
+        <w:t xml:space="preserve">El enlace para añadir preguntas no funcionaba porque el nombre del método en PHP tenía una ñ. Al escribir esa URL en el navegador, la ñ se codificaba como %C3%B1 y el </w:t>
+      </w:r>
+      <w:proofErr w:type="spellStart"/>
+      <w:r>
+        <w:t>router</w:t>
+      </w:r>
+      <w:proofErr w:type="spellEnd"/>
+      <w:r>
+        <w:t xml:space="preserve"> no reconocía el método.</w:t>
+      </w:r>
+    </w:p>
+    <w:p>
+      <w:pPr>
+        <w:spacing w:before="80" w:after="80"/>
+      </w:pPr>
+      <w:r>
+        <w:rPr>
+          <w:i/>
+        </w:rPr>
+        <w:lastRenderedPageBreak/>
+        <w:t>Solución:</w:t>
+      </w:r>
+      <w:r>
+        <w:t xml:space="preserve"> Se renombró el método a </w:t>
+      </w:r>
+      <w:proofErr w:type="spellStart"/>
+      <w:r>
+        <w:t>addPregunta</w:t>
+      </w:r>
+      <w:proofErr w:type="spellEnd"/>
+      <w:r>
+        <w:t xml:space="preserve">, eliminando la ñ del nombre. Como buena práctica, los nombres de métodos que aparecen en </w:t>
+      </w:r>
+      <w:proofErr w:type="spellStart"/>
+      <w:r>
+        <w:t>URLs</w:t>
+      </w:r>
+      <w:proofErr w:type="spellEnd"/>
+      <w:r>
+        <w:t xml:space="preserve"> deben usar solo caracteres ASCII.</w:t>
+      </w:r>
+    </w:p>
+    <w:p>
+      <w:pPr>
+        <w:spacing w:before="80" w:after="80"/>
+      </w:pPr>
+      <w:r>
+        <w:t>5.5. Documentación del proceso</w:t>
+      </w:r>
+    </w:p>
+    <w:p>
+      <w:pPr>
+        <w:spacing w:before="80" w:after="80"/>
+      </w:pPr>
+      <w:r>
+        <w:t>El código actualizado está disponible en el repositorio de GitHub:</w:t>
+      </w:r>
+    </w:p>
+    <w:p>
+      <w:pPr>
+        <w:spacing w:before="80" w:after="80"/>
+      </w:pPr>
+      <w:r>
+        <w:rPr>
+          <w:b/>
+        </w:rPr>
+        <w:t>https://github.com/NestorSoftware/GeoLearn</w:t>
+      </w:r>
+    </w:p>
+    <w:p>
+      <w:pPr>
+        <w:spacing w:before="80" w:after="80"/>
+      </w:pPr>
+      <w:r>
+        <w:t xml:space="preserve">En la siguiente entrega se implementará el sistema de juego (trivial) con la API REST en PHP y JavaScript con </w:t>
+      </w:r>
+      <w:proofErr w:type="spellStart"/>
+      <w:proofErr w:type="gramStart"/>
+      <w:r>
+        <w:t>fetch</w:t>
+      </w:r>
+      <w:proofErr w:type="spellEnd"/>
+      <w:r>
+        <w:t>(</w:t>
+      </w:r>
+      <w:proofErr w:type="gramEnd"/>
+      <w:r>
+        <w:t>), el registro de partidas y las estadísticas de progreso del alumno.</w:t>
+      </w:r>
+    </w:p>
+    <w:p>
+      <w:pPr>
+        <w:spacing w:before="80" w:after="80"/>
+      </w:pPr>
     </w:p>
     <w:sectPr>
       <w:headerReference w:type="default" r:id="rId12"/>
@@ -21409,7 +22079,6 @@
   <w:style w:type="character" w:default="1" w:styleId="Fuentedeprrafopredeter">
     <w:name w:val="Default Paragraph Font"/>
     <w:uiPriority w:val="1"/>
-    <w:semiHidden/>
     <w:unhideWhenUsed/>
   </w:style>
   <w:style w:type="table" w:default="1" w:styleId="Tablanormal">

</xml_diff>